<commit_message>
Update urban_chase_abnt.docx (Entrega 2)
</commit_message>
<xml_diff>
--- a/documentos/Entrega 2/Ética/urban_chase_abnt.docx
+++ b/documentos/Entrega 2/Ética/urban_chase_abnt.docx
@@ -1,6 +1,6 @@
 
 <file path=word/document.xml><?xml version="1.0" encoding="utf-8"?>
-<w:document xmlns:wpc="http://schemas.microsoft.com/office/word/2010/wordprocessingCanvas" xmlns:cx="http://schemas.microsoft.com/office/drawing/2014/chartex" xmlns:cx1="http://schemas.microsoft.com/office/drawing/2015/9/8/chartex" xmlns:cx2="http://schemas.microsoft.com/office/drawing/2015/10/21/chartex" xmlns:cx3="http://schemas.microsoft.com/office/drawing/2016/5/9/chartex" xmlns:cx4="http://schemas.microsoft.com/office/drawing/2016/5/10/chartex" xmlns:cx5="http://schemas.microsoft.com/office/drawing/2016/5/11/chartex" xmlns:cx6="http://schemas.microsoft.com/office/drawing/2016/5/12/chartex" xmlns:cx7="http://schemas.microsoft.com/office/drawing/2016/5/13/chartex" xmlns:cx8="http://schemas.microsoft.com/office/drawing/2016/5/14/chartex" xmlns:mc="http://schemas.openxmlformats.org/markup-compatibility/2006" xmlns:aink="http://schemas.microsoft.com/office/drawing/2016/ink" xmlns:am3d="http://schemas.microsoft.com/office/drawing/2017/model3d" xmlns:o="urn:schemas-microsoft-com:office:office" xmlns:r="http://schemas.openxmlformats.org/officeDocument/2006/relationships" xmlns:m="http://schemas.openxmlformats.org/officeDocument/2006/math" xmlns:v="urn:schemas-microsoft-com:vml" xmlns:wp14="http://schemas.microsoft.com/office/word/2010/wordprocessingDrawing" xmlns:wp="http://schemas.openxmlformats.org/drawingml/2006/wordprocessingDrawing" xmlns:w10="urn:schemas-microsoft-com:office:word" xmlns:w="http://schemas.openxmlformats.org/wordprocessingml/2006/main" xmlns:w14="http://schemas.microsoft.com/office/word/2010/wordml" xmlns:w15="http://schemas.microsoft.com/office/word/2012/wordml" xmlns:w16cid="http://schemas.microsoft.com/office/word/2016/wordml/cid" xmlns:w16se="http://schemas.microsoft.com/office/word/2015/wordml/symex" xmlns:wpg="http://schemas.microsoft.com/office/word/2010/wordprocessingGroup" xmlns:wpi="http://schemas.microsoft.com/office/word/2010/wordprocessingInk" xmlns:wne="http://schemas.microsoft.com/office/word/2006/wordml" xmlns:wps="http://schemas.microsoft.com/office/word/2010/wordprocessingShape" mc:Ignorable="w14 w15 w16se w16cid wp14">
+<w:document xmlns:wpc="http://schemas.microsoft.com/office/word/2010/wordprocessingCanvas" xmlns:cx="http://schemas.microsoft.com/office/drawing/2014/chartex" xmlns:cx1="http://schemas.microsoft.com/office/drawing/2015/9/8/chartex" xmlns:cx2="http://schemas.microsoft.com/office/drawing/2015/10/21/chartex" xmlns:cx3="http://schemas.microsoft.com/office/drawing/2016/5/9/chartex" xmlns:cx4="http://schemas.microsoft.com/office/drawing/2016/5/10/chartex" xmlns:cx5="http://schemas.microsoft.com/office/drawing/2016/5/11/chartex" xmlns:cx6="http://schemas.microsoft.com/office/drawing/2016/5/12/chartex" xmlns:cx7="http://schemas.microsoft.com/office/drawing/2016/5/13/chartex" xmlns:cx8="http://schemas.microsoft.com/office/drawing/2016/5/14/chartex" xmlns:mc="http://schemas.openxmlformats.org/markup-compatibility/2006" xmlns:aink="http://schemas.microsoft.com/office/drawing/2016/ink" xmlns:am3d="http://schemas.microsoft.com/office/drawing/2017/model3d" xmlns:o="urn:schemas-microsoft-com:office:office" xmlns:oel="http://schemas.microsoft.com/office/2019/extlst" xmlns:r="http://schemas.openxmlformats.org/officeDocument/2006/relationships" xmlns:m="http://schemas.openxmlformats.org/officeDocument/2006/math" xmlns:v="urn:schemas-microsoft-com:vml" xmlns:wp14="http://schemas.microsoft.com/office/word/2010/wordprocessingDrawing" xmlns:wp="http://schemas.openxmlformats.org/drawingml/2006/wordprocessingDrawing" xmlns:w10="urn:schemas-microsoft-com:office:word" xmlns:w="http://schemas.openxmlformats.org/wordprocessingml/2006/main" xmlns:w14="http://schemas.microsoft.com/office/word/2010/wordml" xmlns:w15="http://schemas.microsoft.com/office/word/2012/wordml" xmlns:w16cex="http://schemas.microsoft.com/office/word/2018/wordml/cex" xmlns:w16cid="http://schemas.microsoft.com/office/word/2016/wordml/cid" xmlns:w16="http://schemas.microsoft.com/office/word/2018/wordml" xmlns:w16sdtdh="http://schemas.microsoft.com/office/word/2020/wordml/sdtdatahash" xmlns:w16se="http://schemas.microsoft.com/office/word/2015/wordml/symex" xmlns:wpg="http://schemas.microsoft.com/office/word/2010/wordprocessingGroup" xmlns:wpi="http://schemas.microsoft.com/office/word/2010/wordprocessingInk" xmlns:wne="http://schemas.microsoft.com/office/word/2006/wordml" xmlns:wps="http://schemas.microsoft.com/office/word/2010/wordprocessingShape" mc:Ignorable="w14 w15 w16se w16cid w16 w16cex w16sdtdh wp14">
   <w:body>
     <w:p>
       <w:pPr>
@@ -87,21 +87,8 @@
         <w:jc w:val="center"/>
       </w:pPr>
       <w:r>
-        <w:t xml:space="preserve">André </w:t>
-      </w:r>
-      <w:proofErr w:type="spellStart"/>
-      <w:r>
-        <w:t>Makoto</w:t>
-      </w:r>
-      <w:proofErr w:type="spellEnd"/>
-      <w:r>
-        <w:t xml:space="preserve"> </w:t>
-      </w:r>
-      <w:proofErr w:type="spellStart"/>
-      <w:r>
-        <w:t>Molitor</w:t>
-      </w:r>
-      <w:proofErr w:type="spellEnd"/>
+        <w:t>André Makoto Molitor</w:t>
+      </w:r>
     </w:p>
     <w:p>
       <w:pPr>
@@ -124,6 +111,7 @@
         <w:jc w:val="center"/>
       </w:pPr>
       <w:r>
+        <w:lastRenderedPageBreak/>
         <w:t>Davi Moraes Muniz</w:t>
       </w:r>
     </w:p>
@@ -157,131 +145,131 @@
           <w:b/>
           <w:bCs/>
         </w:rPr>
+        <w:t>RESUMO</w:t>
+      </w:r>
+    </w:p>
+    <w:p>
+      <w:pPr>
+        <w:ind w:firstLine="709"/>
+        <w:jc w:val="both"/>
+      </w:pPr>
+      <w:r>
+        <w:t>Este relatório apresenta uma análise crítica sobre o impacto ético e social do jogo Urban Chase, um jogo 3D de estratégia e perseguição desenvolvido no contexto acadêmico</w:t>
+      </w:r>
+      <w:r>
+        <w:t xml:space="preserve"> com plataformas de tecnologia, como </w:t>
+      </w:r>
+      <w:r>
+        <w:t>Unity, junto a linguagem de programação C#.</w:t>
+      </w:r>
+    </w:p>
+    <w:p>
+      <w:pPr>
+        <w:ind w:firstLine="709"/>
+        <w:jc w:val="both"/>
+      </w:pPr>
+      <w:r>
+        <w:t>Fundamentado nisso, é perceptível analisar que</w:t>
+      </w:r>
+      <w:r>
+        <w:t xml:space="preserve"> </w:t>
+      </w:r>
+      <w:r>
+        <w:t>o</w:t>
+      </w:r>
+      <w:r>
+        <w:t xml:space="preserve"> protótipo</w:t>
+      </w:r>
+      <w:r>
+        <w:t xml:space="preserve"> aborda aspectos fundamentais</w:t>
+      </w:r>
+      <w:r>
+        <w:t>,</w:t>
+      </w:r>
+      <w:r>
+        <w:t xml:space="preserve"> como</w:t>
+      </w:r>
+      <w:r>
+        <w:t>:</w:t>
+      </w:r>
+      <w:r>
+        <w:t xml:space="preserve"> privacidade e segurança de dados, modelos de monetização éticos, acessibilidade</w:t>
+      </w:r>
+      <w:r>
+        <w:t>,</w:t>
+      </w:r>
+      <w:r>
+        <w:t xml:space="preserve"> e inclusão,</w:t>
+      </w:r>
+      <w:r>
+        <w:t xml:space="preserve"> </w:t>
+      </w:r>
+      <w:r>
+        <w:t xml:space="preserve">com a finalidade de </w:t>
+      </w:r>
+      <w:r>
+        <w:t>conscientizar o seu usuário mediante uma abordagem não só prática, como também imersiva</w:t>
+      </w:r>
+      <w:r>
+        <w:t xml:space="preserve"> perante </w:t>
+      </w:r>
+      <w:r>
+        <w:t>os</w:t>
+      </w:r>
+      <w:r>
+        <w:t xml:space="preserve"> temas.</w:t>
+      </w:r>
+    </w:p>
+    <w:p>
+      <w:pPr>
+        <w:ind w:firstLine="709"/>
+        <w:jc w:val="both"/>
+      </w:pPr>
+      <w:r>
         <w:lastRenderedPageBreak/>
-        <w:t>RESUMO</w:t>
-      </w:r>
-    </w:p>
-    <w:p>
-      <w:pPr>
-        <w:ind w:firstLine="709"/>
-        <w:jc w:val="both"/>
-      </w:pPr>
-      <w:r>
-        <w:t>Este relatório apresenta uma análise crítica sobre o impacto ético e social do jogo Urban Chase, um jogo 3D de estratégia e perseguição desenvolvido no contexto acadêmico</w:t>
-      </w:r>
-      <w:r>
-        <w:t xml:space="preserve"> com plataformas de tecnologia, como </w:t>
-      </w:r>
-      <w:r>
-        <w:t>Unity, junto a linguagem de programação C#.</w:t>
-      </w:r>
-    </w:p>
-    <w:p>
-      <w:pPr>
-        <w:ind w:firstLine="709"/>
-        <w:jc w:val="both"/>
-      </w:pPr>
-      <w:r>
-        <w:t>Fundamentado nisso, é perceptível analisar que</w:t>
+        <w:t>Sob esse contexto, nota-se que o</w:t>
       </w:r>
       <w:r>
         <w:t xml:space="preserve"> </w:t>
       </w:r>
       <w:r>
-        <w:t>o</w:t>
-      </w:r>
-      <w:r>
-        <w:t xml:space="preserve"> protótipo</w:t>
-      </w:r>
-      <w:r>
-        <w:t xml:space="preserve"> aborda aspectos fundamentais</w:t>
-      </w:r>
-      <w:r>
-        <w:t>,</w:t>
-      </w:r>
-      <w:r>
-        <w:t xml:space="preserve"> como</w:t>
-      </w:r>
-      <w:r>
-        <w:t>:</w:t>
-      </w:r>
-      <w:r>
-        <w:t xml:space="preserve"> privacidade e segurança de dados, modelos de monetização éticos, acessibilidade</w:t>
-      </w:r>
-      <w:r>
-        <w:t>,</w:t>
-      </w:r>
-      <w:r>
-        <w:t xml:space="preserve"> e inclusão,</w:t>
+        <w:t>Urban</w:t>
+      </w:r>
+      <w:r>
+        <w:t xml:space="preserve"> Chase </w:t>
+      </w:r>
+      <w:r>
+        <w:t>possui</w:t>
+      </w:r>
+      <w:r>
+        <w:t xml:space="preserve"> potencial para atuar em campanhas de educação patrimonial e cidadã</w:t>
+      </w:r>
+      <w:r>
+        <w:t>, sendo um dif</w:t>
+      </w:r>
+      <w:r>
+        <w:t>erencial</w:t>
+      </w:r>
+      <w:r>
+        <w:t>, porque,</w:t>
       </w:r>
       <w:r>
         <w:t xml:space="preserve"> </w:t>
       </w:r>
       <w:r>
-        <w:t xml:space="preserve">com a finalidade de </w:t>
-      </w:r>
-      <w:r>
-        <w:t>conscientizar o seu usuário mediante uma abordagem não só prática, como também imersiva</w:t>
-      </w:r>
-      <w:r>
-        <w:t xml:space="preserve"> perante </w:t>
-      </w:r>
-      <w:r>
-        <w:t>os</w:t>
-      </w:r>
-      <w:r>
-        <w:t xml:space="preserve"> temas.</w:t>
-      </w:r>
-    </w:p>
-    <w:p>
-      <w:pPr>
-        <w:ind w:firstLine="709"/>
-        <w:jc w:val="both"/>
-      </w:pPr>
-      <w:r>
-        <w:t>Sob esse contexto, nota-se que o</w:t>
+        <w:t>no mercado de jogos atual, existe uma lacuna de mercado no que se tange a protótipos que mesclam propostas educativas, potencial prático de aplicação e imersão com o jogador</w:t>
+      </w:r>
+      <w:r>
+        <w:t>.</w:t>
       </w:r>
       <w:r>
         <w:t xml:space="preserve"> </w:t>
       </w:r>
-      <w:r>
-        <w:t>Urban</w:t>
-      </w:r>
-      <w:r>
-        <w:t xml:space="preserve"> Chase </w:t>
-      </w:r>
-      <w:r>
-        <w:t>possui</w:t>
-      </w:r>
-      <w:r>
-        <w:t xml:space="preserve"> potencial para atuar em campanhas de educação patrimonial e cidadã</w:t>
-      </w:r>
-      <w:r>
-        <w:t>, sendo um dif</w:t>
-      </w:r>
-      <w:r>
-        <w:t>erencial</w:t>
-      </w:r>
-      <w:r>
-        <w:t>, porque,</w:t>
-      </w:r>
-      <w:r>
-        <w:t xml:space="preserve"> </w:t>
-      </w:r>
-      <w:r>
-        <w:t>no mercado de jogos atual, existe uma lacuna de mercado no que se tange a protótipos que mesclam propostas educativas, potencial prático de aplicação e imersão com o jogador</w:t>
-      </w:r>
-      <w:r>
-        <w:t>.</w:t>
-      </w:r>
-      <w:r>
-        <w:t xml:space="preserve"> </w:t>
-      </w:r>
     </w:p>
     <w:p>
       <w:pPr>
         <w:pStyle w:val="NormalWeb"/>
-        <w:spacing w:line="360" w:lineRule="auto"/>
+        <w:spacing w:line="480" w:lineRule="auto"/>
         <w:jc w:val="both"/>
         <w:rPr>
           <w:rFonts w:ascii="Arial" w:eastAsia="Arial" w:hAnsi="Arial" w:cs="Arial"/>
@@ -369,8 +357,35 @@
           <w:bCs/>
           <w:caps/>
         </w:rPr>
+        <w:t>1 INTRODUÇÃO</w:t>
+      </w:r>
+    </w:p>
+    <w:p>
+      <w:pPr>
+        <w:ind w:firstLine="709"/>
+        <w:jc w:val="both"/>
+      </w:pPr>
+      <w:r>
         <w:lastRenderedPageBreak/>
-        <w:t>1 INTRODUÇÃO</w:t>
+        <w:t>É notório afirmar que o</w:t>
+      </w:r>
+      <w:r>
+        <w:t xml:space="preserve"> presente relatório tem como objetivo realizar uma análise crítica sobre o impacto ético e social do jogo Urban Chase, um jogo 3D de estratégia e perseguição</w:t>
+      </w:r>
+      <w:r>
+        <w:t xml:space="preserve">, que tem seu </w:t>
+      </w:r>
+      <w:r>
+        <w:t>desenvolvimento no contexto acadêmico</w:t>
+      </w:r>
+      <w:r>
+        <w:t xml:space="preserve"> feito com </w:t>
+      </w:r>
+      <w:r>
+        <w:t>ferramentas tecnológicas (como a engine Unity e a linguagem de programação C#)</w:t>
+      </w:r>
+      <w:r>
+        <w:t>.</w:t>
       </w:r>
     </w:p>
     <w:p>
@@ -379,33 +394,6 @@
         <w:jc w:val="both"/>
       </w:pPr>
       <w:r>
-        <w:t>É notório afirmar que o</w:t>
-      </w:r>
-      <w:r>
-        <w:t xml:space="preserve"> presente relatório tem como objetivo realizar uma análise crítica sobre o impacto ético e social do jogo Urban Chase, um jogo 3D de estratégia e perseguição</w:t>
-      </w:r>
-      <w:r>
-        <w:t xml:space="preserve">, que tem seu </w:t>
-      </w:r>
-      <w:r>
-        <w:t>desenvolvimento no contexto acadêmico</w:t>
-      </w:r>
-      <w:r>
-        <w:t xml:space="preserve"> feito com </w:t>
-      </w:r>
-      <w:r>
-        <w:t>ferramentas tecnológicas (como a engine Unity e a linguagem de programação C#)</w:t>
-      </w:r>
-      <w:r>
-        <w:t>.</w:t>
-      </w:r>
-    </w:p>
-    <w:p>
-      <w:pPr>
-        <w:ind w:firstLine="709"/>
-        <w:jc w:val="both"/>
-      </w:pPr>
-      <w:r>
         <w:t>A narrativa do jogo é centrada em:</w:t>
       </w:r>
       <w:r>
@@ -504,87 +492,18 @@
     </w:p>
     <w:p>
       <w:pPr>
-        <w:pStyle w:val="Ttulo1"/>
-        <w:spacing w:before="240" w:after="120"/>
+        <w:pStyle w:val="Forte1"/>
+      </w:pPr>
+      <w:r>
+        <w:t>2 PRIVACIDADE E SEGURANÇA</w:t>
+      </w:r>
+    </w:p>
+    <w:p>
+      <w:pPr>
+        <w:pStyle w:val="Forte1"/>
         <w:rPr>
           <w:caps/>
         </w:rPr>
-      </w:pPr>
-    </w:p>
-    <w:p>
-      <w:pPr>
-        <w:pStyle w:val="Ttulo1"/>
-        <w:spacing w:before="240" w:after="120"/>
-        <w:rPr>
-          <w:caps/>
-        </w:rPr>
-      </w:pPr>
-    </w:p>
-    <w:p>
-      <w:pPr>
-        <w:pStyle w:val="Ttulo1"/>
-        <w:spacing w:before="240" w:after="120"/>
-        <w:rPr>
-          <w:caps/>
-        </w:rPr>
-      </w:pPr>
-    </w:p>
-    <w:p>
-      <w:pPr>
-        <w:pStyle w:val="Ttulo1"/>
-        <w:spacing w:before="240" w:after="120"/>
-        <w:rPr>
-          <w:caps/>
-        </w:rPr>
-      </w:pPr>
-    </w:p>
-    <w:p>
-      <w:pPr>
-        <w:pStyle w:val="Ttulo1"/>
-        <w:spacing w:before="240" w:after="120"/>
-        <w:rPr>
-          <w:caps/>
-        </w:rPr>
-      </w:pPr>
-    </w:p>
-    <w:p>
-      <w:pPr>
-        <w:pStyle w:val="Ttulo1"/>
-        <w:spacing w:before="240" w:after="120"/>
-        <w:rPr>
-          <w:caps/>
-        </w:rPr>
-      </w:pPr>
-    </w:p>
-    <w:p>
-      <w:pPr>
-        <w:pStyle w:val="Ttulo1"/>
-        <w:spacing w:before="240" w:after="120"/>
-        <w:rPr>
-          <w:caps/>
-        </w:rPr>
-      </w:pPr>
-    </w:p>
-    <w:p>
-      <w:pPr>
-        <w:pStyle w:val="Ttulo1"/>
-        <w:spacing w:before="240" w:after="120"/>
-        <w:rPr>
-          <w:caps/>
-        </w:rPr>
-      </w:pPr>
-      <w:r>
-        <w:rPr>
-          <w:caps/>
-        </w:rPr>
-        <w:lastRenderedPageBreak/>
-        <w:t>2 PRIVACIDADE E SEGURANÇA</w:t>
-      </w:r>
-    </w:p>
-    <w:p>
-      <w:pPr>
-        <w:pStyle w:val="Ttulo1"/>
-        <w:spacing w:before="240" w:after="120"/>
       </w:pPr>
       <w:r>
         <w:t>2.1 Análise do Cenário Atual</w:t>
@@ -714,15 +633,7 @@
         <w:t>is</w:t>
       </w:r>
       <w:r>
-        <w:t xml:space="preserve">, segundo pesquisa da </w:t>
-      </w:r>
-      <w:proofErr w:type="spellStart"/>
-      <w:r>
-        <w:t>OpenText</w:t>
-      </w:r>
-      <w:proofErr w:type="spellEnd"/>
-      <w:r>
-        <w:t xml:space="preserve"> com 2 mil entrevistados no Brasil,</w:t>
+        <w:t>, segundo pesquisa da OpenText com 2 mil entrevistados no Brasil,</w:t>
       </w:r>
       <w:r>
         <w:t xml:space="preserve"> o usuário </w:t>
@@ -758,7 +669,7 @@
     <w:p>
       <w:pPr>
         <w:pStyle w:val="NormalWeb"/>
-        <w:spacing w:line="360" w:lineRule="auto"/>
+        <w:spacing w:line="480" w:lineRule="auto"/>
         <w:ind w:firstLine="708"/>
         <w:jc w:val="both"/>
         <w:rPr>
@@ -805,20 +716,242 @@
         <w:rPr>
           <w:rFonts w:ascii="Arial" w:hAnsi="Arial" w:cs="Arial"/>
         </w:rPr>
-        <w:t xml:space="preserve">elatórios recentes apontam </w:t>
+        <w:t xml:space="preserve">elatórios recentes apontam crescimento expressivo de incidentes de vazamento: um levantamento citado pelo MIT indica </w:t>
+      </w:r>
+      <w:r>
+        <w:rPr>
+          <w:rFonts w:ascii="Arial" w:hAnsi="Arial" w:cs="Arial"/>
+        </w:rPr>
+        <w:t>a</w:t>
+      </w:r>
+      <w:r>
+        <w:rPr>
+          <w:rFonts w:ascii="Arial" w:hAnsi="Arial" w:cs="Arial"/>
+        </w:rPr>
+        <w:t>umento de 493% nos vazamentos de dados no Brasil em determinados períodos recentes. Por isso, estes dados sempre devem estar confidenciais.</w:t>
+      </w:r>
+    </w:p>
+    <w:p>
+      <w:pPr>
+        <w:pStyle w:val="NormalWeb"/>
+        <w:spacing w:line="480" w:lineRule="auto"/>
+        <w:ind w:firstLine="708"/>
+        <w:jc w:val="both"/>
+        <w:rPr>
+          <w:rFonts w:ascii="Arial" w:hAnsi="Arial" w:cs="Arial"/>
+        </w:rPr>
+      </w:pPr>
+    </w:p>
+    <w:p>
+      <w:pPr>
+        <w:pStyle w:val="NormalWeb"/>
+        <w:spacing w:line="480" w:lineRule="auto"/>
+        <w:ind w:firstLine="708"/>
+        <w:jc w:val="both"/>
+        <w:rPr>
+          <w:rFonts w:ascii="Arial" w:hAnsi="Arial" w:cs="Arial"/>
+        </w:rPr>
+      </w:pPr>
+    </w:p>
+    <w:p>
+      <w:pPr>
+        <w:pStyle w:val="NormalWeb"/>
+        <w:spacing w:line="480" w:lineRule="auto"/>
+        <w:ind w:firstLine="708"/>
+        <w:jc w:val="both"/>
+        <w:rPr>
+          <w:rFonts w:ascii="Arial" w:hAnsi="Arial" w:cs="Arial"/>
+        </w:rPr>
+      </w:pPr>
+    </w:p>
+    <w:p>
+      <w:pPr>
+        <w:pStyle w:val="NormalWeb"/>
+        <w:spacing w:line="480" w:lineRule="auto"/>
+        <w:ind w:firstLine="708"/>
+        <w:jc w:val="both"/>
+        <w:rPr>
+          <w:rFonts w:ascii="Arial" w:hAnsi="Arial" w:cs="Arial"/>
+        </w:rPr>
+      </w:pPr>
+    </w:p>
+    <w:p>
+      <w:pPr>
+        <w:pStyle w:val="NormalWeb"/>
+        <w:spacing w:line="480" w:lineRule="auto"/>
+        <w:ind w:firstLine="708"/>
+        <w:jc w:val="both"/>
+        <w:rPr>
+          <w:rFonts w:ascii="Arial" w:hAnsi="Arial" w:cs="Arial"/>
+          <w:b/>
+          <w:bCs/>
+        </w:rPr>
+      </w:pPr>
+      <w:r>
+        <w:rPr>
+          <w:rFonts w:ascii="Arial" w:hAnsi="Arial" w:cs="Arial"/>
+          <w:b/>
+          <w:bCs/>
+        </w:rPr>
+        <w:t>Figura 1: Gráfico sobre aumento de vazamento de dados no Brasil</w:t>
+      </w:r>
+    </w:p>
+    <w:p>
+      <w:pPr>
+        <w:pStyle w:val="NormalWeb"/>
+        <w:spacing w:line="480" w:lineRule="auto"/>
+        <w:ind w:firstLine="708"/>
+        <w:jc w:val="both"/>
+        <w:rPr>
+          <w:rFonts w:ascii="Arial" w:hAnsi="Arial" w:cs="Arial"/>
+        </w:rPr>
+      </w:pPr>
+      <w:r>
+        <w:rPr>
+          <w:rFonts w:ascii="Arial" w:hAnsi="Arial" w:cs="Arial"/>
+          <w:noProof/>
+        </w:rPr>
+        <w:drawing>
+          <wp:inline distT="0" distB="0" distL="0" distR="0" wp14:anchorId="7C6EF564" wp14:editId="1A4EAB42">
+            <wp:extent cx="4972050" cy="4378086"/>
+            <wp:effectExtent l="0" t="0" r="0" b="3810"/>
+            <wp:docPr id="2" name="Imagem 2"/>
+            <wp:cNvGraphicFramePr>
+              <a:graphicFrameLocks xmlns:a="http://schemas.openxmlformats.org/drawingml/2006/main" noChangeAspect="1"/>
+            </wp:cNvGraphicFramePr>
+            <a:graphic xmlns:a="http://schemas.openxmlformats.org/drawingml/2006/main">
+              <a:graphicData uri="http://schemas.openxmlformats.org/drawingml/2006/picture">
+                <pic:pic xmlns:pic="http://schemas.openxmlformats.org/drawingml/2006/picture">
+                  <pic:nvPicPr>
+                    <pic:cNvPr id="0" name="Picture 3"/>
+                    <pic:cNvPicPr>
+                      <a:picLocks noChangeAspect="1" noChangeArrowheads="1"/>
+                    </pic:cNvPicPr>
+                  </pic:nvPicPr>
+                  <pic:blipFill>
+                    <a:blip r:embed="rId10">
+                      <a:extLst>
+                        <a:ext uri="{28A0092B-C50C-407E-A947-70E740481C1C}">
+                          <a14:useLocalDpi xmlns:a14="http://schemas.microsoft.com/office/drawing/2010/main" val="0"/>
+                        </a:ext>
+                      </a:extLst>
+                    </a:blip>
+                    <a:srcRect/>
+                    <a:stretch>
+                      <a:fillRect/>
+                    </a:stretch>
+                  </pic:blipFill>
+                  <pic:spPr bwMode="auto">
+                    <a:xfrm>
+                      <a:off x="0" y="0"/>
+                      <a:ext cx="4973880" cy="4379697"/>
+                    </a:xfrm>
+                    <a:prstGeom prst="rect">
+                      <a:avLst/>
+                    </a:prstGeom>
+                    <a:noFill/>
+                    <a:ln>
+                      <a:noFill/>
+                    </a:ln>
+                  </pic:spPr>
+                </pic:pic>
+              </a:graphicData>
+            </a:graphic>
+          </wp:inline>
+        </w:drawing>
+      </w:r>
+    </w:p>
+    <w:p>
+      <w:pPr>
+        <w:pStyle w:val="NormalWeb"/>
+        <w:spacing w:line="480" w:lineRule="auto"/>
+        <w:ind w:firstLine="708"/>
+        <w:jc w:val="both"/>
+        <w:rPr>
+          <w:rFonts w:ascii="Arial" w:hAnsi="Arial" w:cs="Arial"/>
+        </w:rPr>
+      </w:pPr>
+    </w:p>
+    <w:p>
+      <w:pPr>
+        <w:pStyle w:val="NormalWeb"/>
+        <w:spacing w:line="480" w:lineRule="auto"/>
+        <w:ind w:firstLine="708"/>
+        <w:jc w:val="both"/>
+        <w:rPr>
+          <w:rFonts w:ascii="Arial" w:hAnsi="Arial" w:cs="Arial"/>
+        </w:rPr>
+      </w:pPr>
+      <w:r>
+        <w:rPr>
+          <w:rFonts w:ascii="Arial" w:hAnsi="Arial" w:cs="Arial"/>
+        </w:rPr>
+        <w:t>Portanto, a</w:t>
+      </w:r>
+      <w:r>
+        <w:rPr>
+          <w:rFonts w:ascii="Arial" w:hAnsi="Arial" w:cs="Arial"/>
+        </w:rPr>
+        <w:t xml:space="preserve">ssim como a Nintendo enfatiza a segurança do ambiente para o público infantil, o Urban Chase visa ser um ambiente seguro, priorizando a proteção do </w:t>
       </w:r>
       <w:r>
         <w:rPr>
           <w:rFonts w:ascii="Arial" w:hAnsi="Arial" w:cs="Arial"/>
         </w:rPr>
         <w:lastRenderedPageBreak/>
-        <w:t>crescimento expressivo de incidentes de vazamento: um levantamento citado pelo MIT indica aumento de 493% nos vazamentos de dados no Brasil em determinados períodos recentes. Por isso, estes dados sempre devem estar confidenciais.</w:t>
+        <w:t>usuário acima da monetização de dados</w:t>
+      </w:r>
+      <w:r>
+        <w:rPr>
+          <w:rFonts w:ascii="Arial" w:hAnsi="Arial" w:cs="Arial"/>
+        </w:rPr>
+        <w:t>, ainda mais tendo em vista que, infelizmente, ainda existem poucos jogos que se preocupam com a segurança dos jogadores.</w:t>
+      </w:r>
+    </w:p>
+    <w:p>
+      <w:pPr>
+        <w:pStyle w:val="Forte1"/>
+      </w:pPr>
+    </w:p>
+    <w:p>
+      <w:pPr>
+        <w:pStyle w:val="Forte1"/>
+      </w:pPr>
+    </w:p>
+    <w:p>
+      <w:pPr>
+        <w:pStyle w:val="Forte1"/>
+      </w:pPr>
+    </w:p>
+    <w:p>
+      <w:pPr>
+        <w:pStyle w:val="Forte1"/>
+      </w:pPr>
+      <w:r>
+        <w:t>3 MONETIZAÇÃO E ÉTICA</w:t>
+      </w:r>
+    </w:p>
+    <w:p>
+      <w:pPr>
+        <w:pStyle w:val="Forte1"/>
+      </w:pPr>
+      <w:r>
+        <w:t>3.1 Modelo de Receita Proposto</w:t>
+      </w:r>
+    </w:p>
+    <w:p>
+      <w:pPr>
+        <w:ind w:firstLine="709"/>
+        <w:jc w:val="both"/>
+      </w:pPr>
+      <w:r>
+        <w:t xml:space="preserve">Atualmente, o Urban Chase não possui um modelo de monetização ativo, sendo um projeto acadêmico sem fins lucrativos imediatos. </w:t>
       </w:r>
     </w:p>
     <w:p>
       <w:pPr>
         <w:pStyle w:val="NormalWeb"/>
-        <w:spacing w:line="360" w:lineRule="auto"/>
+        <w:spacing w:line="480" w:lineRule="auto"/>
         <w:ind w:firstLine="708"/>
         <w:jc w:val="both"/>
         <w:rPr>
@@ -829,175 +962,6 @@
         <w:rPr>
           <w:rFonts w:ascii="Arial" w:hAnsi="Arial" w:cs="Arial"/>
         </w:rPr>
-        <w:t>Portanto, a</w:t>
-      </w:r>
-      <w:r>
-        <w:rPr>
-          <w:rFonts w:ascii="Arial" w:hAnsi="Arial" w:cs="Arial"/>
-        </w:rPr>
-        <w:t>ssim como a Nintendo enfatiza a segurança do ambiente para o público infantil, o Urban Chase visa ser um ambiente seguro, priorizando a proteção do usuário acima da monetização de dados</w:t>
-      </w:r>
-      <w:r>
-        <w:rPr>
-          <w:rFonts w:ascii="Arial" w:hAnsi="Arial" w:cs="Arial"/>
-        </w:rPr>
-        <w:t>, ainda mais tendo em vista que, infelizmente, ainda existem poucos jogos que se preocupam com a segurança dos jogadores.</w:t>
-      </w:r>
-    </w:p>
-    <w:p/>
-    <w:p>
-      <w:pPr>
-        <w:pStyle w:val="Ttulo1"/>
-        <w:spacing w:before="240" w:after="120"/>
-        <w:rPr>
-          <w:caps/>
-        </w:rPr>
-      </w:pPr>
-    </w:p>
-    <w:p>
-      <w:pPr>
-        <w:pStyle w:val="Ttulo1"/>
-        <w:spacing w:before="240" w:after="120"/>
-        <w:rPr>
-          <w:caps/>
-        </w:rPr>
-      </w:pPr>
-    </w:p>
-    <w:p>
-      <w:pPr>
-        <w:pStyle w:val="Ttulo1"/>
-        <w:spacing w:before="240" w:after="120"/>
-        <w:rPr>
-          <w:caps/>
-        </w:rPr>
-      </w:pPr>
-    </w:p>
-    <w:p>
-      <w:pPr>
-        <w:pStyle w:val="Ttulo1"/>
-        <w:spacing w:before="240" w:after="120"/>
-        <w:rPr>
-          <w:caps/>
-        </w:rPr>
-      </w:pPr>
-    </w:p>
-    <w:p>
-      <w:pPr>
-        <w:pStyle w:val="Ttulo1"/>
-        <w:spacing w:before="240" w:after="120"/>
-        <w:rPr>
-          <w:caps/>
-        </w:rPr>
-      </w:pPr>
-    </w:p>
-    <w:p>
-      <w:pPr>
-        <w:pStyle w:val="Ttulo1"/>
-        <w:spacing w:before="240" w:after="120"/>
-        <w:rPr>
-          <w:caps/>
-        </w:rPr>
-      </w:pPr>
-    </w:p>
-    <w:p>
-      <w:pPr>
-        <w:pStyle w:val="Ttulo1"/>
-        <w:spacing w:before="240" w:after="120"/>
-        <w:rPr>
-          <w:caps/>
-        </w:rPr>
-      </w:pPr>
-    </w:p>
-    <w:p>
-      <w:pPr>
-        <w:pStyle w:val="Ttulo1"/>
-        <w:spacing w:before="240" w:after="120"/>
-        <w:rPr>
-          <w:caps/>
-        </w:rPr>
-      </w:pPr>
-    </w:p>
-    <w:p>
-      <w:pPr>
-        <w:pStyle w:val="Ttulo1"/>
-        <w:spacing w:before="240" w:after="120"/>
-        <w:rPr>
-          <w:caps/>
-        </w:rPr>
-      </w:pPr>
-    </w:p>
-    <w:p>
-      <w:pPr>
-        <w:pStyle w:val="Ttulo1"/>
-        <w:spacing w:before="240" w:after="120"/>
-        <w:rPr>
-          <w:caps/>
-        </w:rPr>
-      </w:pPr>
-    </w:p>
-    <w:p>
-      <w:pPr>
-        <w:pStyle w:val="Ttulo1"/>
-        <w:spacing w:before="240" w:after="120"/>
-        <w:rPr>
-          <w:caps/>
-        </w:rPr>
-      </w:pPr>
-    </w:p>
-    <w:p>
-      <w:pPr>
-        <w:pStyle w:val="Ttulo1"/>
-        <w:spacing w:before="240" w:after="120"/>
-        <w:rPr>
-          <w:caps/>
-        </w:rPr>
-      </w:pPr>
-    </w:p>
-    <w:p>
-      <w:pPr>
-        <w:pStyle w:val="Ttulo1"/>
-        <w:spacing w:before="240" w:after="120"/>
-      </w:pPr>
-      <w:r>
-        <w:rPr>
-          <w:caps/>
-        </w:rPr>
-        <w:lastRenderedPageBreak/>
-        <w:t>3 MONETIZAÇÃO E ÉTICA</w:t>
-      </w:r>
-    </w:p>
-    <w:p>
-      <w:pPr>
-        <w:pStyle w:val="Ttulo2"/>
-        <w:spacing w:before="240" w:after="120"/>
-      </w:pPr>
-      <w:r>
-        <w:t>3.1 Modelo de Receita Proposto</w:t>
-      </w:r>
-    </w:p>
-    <w:p>
-      <w:pPr>
-        <w:ind w:firstLine="709"/>
-        <w:jc w:val="both"/>
-      </w:pPr>
-      <w:r>
-        <w:t xml:space="preserve">Atualmente, o Urban Chase não possui um modelo de monetização ativo, sendo um projeto acadêmico sem fins lucrativos imediatos. </w:t>
-      </w:r>
-    </w:p>
-    <w:p>
-      <w:pPr>
-        <w:pStyle w:val="NormalWeb"/>
-        <w:spacing w:line="360" w:lineRule="auto"/>
-        <w:ind w:firstLine="708"/>
-        <w:jc w:val="both"/>
-        <w:rPr>
-          <w:rFonts w:ascii="Arial" w:hAnsi="Arial" w:cs="Arial"/>
-        </w:rPr>
-      </w:pPr>
-      <w:r>
-        <w:rPr>
-          <w:rFonts w:ascii="Arial" w:hAnsi="Arial" w:cs="Arial"/>
-        </w:rPr>
         <w:t>Entretanto, o modelo de negócios do jogo</w:t>
       </w:r>
       <w:r>
@@ -1081,8 +1045,7 @@
     </w:p>
     <w:p>
       <w:pPr>
-        <w:pStyle w:val="Ttulo2"/>
-        <w:spacing w:before="240" w:after="120"/>
+        <w:pStyle w:val="Forte1"/>
       </w:pPr>
       <w:r>
         <w:t>3.2 Análise Crítica e Posicionamento Ético</w:t>
@@ -1134,23 +1097,7 @@
           <w:rStyle w:val="Forte"/>
           <w:b w:val="0"/>
         </w:rPr>
-        <w:t xml:space="preserve">45,9% dos usuários frequentes de </w:t>
-      </w:r>
-      <w:proofErr w:type="spellStart"/>
-      <w:r>
-        <w:rPr>
-          <w:rStyle w:val="Forte"/>
-          <w:b w:val="0"/>
-        </w:rPr>
-        <w:t>loot</w:t>
-      </w:r>
-      <w:proofErr w:type="spellEnd"/>
-      <w:r>
-        <w:rPr>
-          <w:rStyle w:val="Forte"/>
-          <w:b w:val="0"/>
-        </w:rPr>
-        <w:t xml:space="preserve"> boxes</w:t>
+        <w:t>45,9% dos usuários frequentes de loot boxes</w:t>
       </w:r>
       <w:r>
         <w:t xml:space="preserve"> preenchiam critérios de comportamento problemático relacionado a apostas.</w:t>
@@ -1159,7 +1106,11 @@
         <w:t xml:space="preserve"> </w:t>
       </w:r>
       <w:r>
-        <w:t xml:space="preserve">Isso mostra a importância do game </w:t>
+        <w:t xml:space="preserve">Isso mostra </w:t>
+      </w:r>
+      <w:r>
+        <w:lastRenderedPageBreak/>
+        <w:t xml:space="preserve">a importância do game </w:t>
       </w:r>
       <w:r>
         <w:t xml:space="preserve">construir um forte engajamento contra estas práticas, </w:t>
@@ -1207,842 +1158,739 @@
         <w:jc w:val="both"/>
       </w:pPr>
       <w:r>
+        <w:t xml:space="preserve">Dessa forma, </w:t>
+      </w:r>
+      <w:r>
+        <w:t>O Urban Chase, ao focar na estratégia e preservação do patrimônio, rejeita essa</w:t>
+      </w:r>
+      <w:r>
+        <w:t>s</w:t>
+      </w:r>
+      <w:r>
+        <w:t xml:space="preserve"> mecânica</w:t>
+      </w:r>
+      <w:r>
+        <w:t>s, pois, nitidamente, percebe que ela pode causar danos severos a integridade social, mental e financeira do jogador, como gastos excessivos, redução do sono, danos a alimentação, redução de hidratação, isolamento social, transtornos psicológicos, como depressão e ansiedade, além de alterações no humor ou no comportamento decorrentes do estímulo apelativo originado por essas interfaces, as quais, não tem preocupação moral com o jogador, apenas com monetização decorridos de sua jornada, seja ela qualquer que seja.</w:t>
+      </w:r>
+    </w:p>
+    <w:p>
+      <w:pPr>
+        <w:pStyle w:val="NormalWeb"/>
+        <w:spacing w:line="480" w:lineRule="auto"/>
+        <w:ind w:firstLine="360"/>
+        <w:jc w:val="both"/>
+        <w:rPr>
+          <w:rFonts w:ascii="Arial" w:hAnsi="Arial" w:cs="Arial"/>
+        </w:rPr>
+      </w:pPr>
+      <w:r>
+        <w:rPr>
+          <w:rFonts w:ascii="Arial" w:hAnsi="Arial" w:cs="Arial"/>
+        </w:rPr>
         <w:lastRenderedPageBreak/>
-        <w:t xml:space="preserve">Dessa forma, </w:t>
-      </w:r>
-      <w:r>
-        <w:t>O Urban Chase, ao focar na estratégia e preservação do patrimônio, rejeita essa</w:t>
-      </w:r>
-      <w:r>
-        <w:t>s</w:t>
-      </w:r>
-      <w:r>
-        <w:t xml:space="preserve"> mecânica</w:t>
-      </w:r>
-      <w:r>
-        <w:t>s, pois, nitidamente, percebe que ela pode causar danos severos a integridade social, mental e financeira do jogador, como gastos excessivos, redução do sono, danos a alimentação, redução de hidratação, isolamento social, transtornos psicológicos, como depressão e ansiedade, além de alterações no humor ou no comportamento decorrentes do estímulo apelativo originado por essas interfaces, as quais, não tem preocupação moral com o jogador, apenas com monetização decorridos de sua jornada, seja ela qualquer que seja.</w:t>
+        <w:t>Outro fator crucial é a equidade</w:t>
+      </w:r>
+      <w:r>
+        <w:rPr>
+          <w:rFonts w:ascii="Arial" w:hAnsi="Arial" w:cs="Arial"/>
+        </w:rPr>
+        <w:t>. A Pesquisa Game Brasil 2025 mostrou que pessoas de menor renda jogam principalmente no celular, e consoles e PCs gamer continuam concentrados nas classes mais altas.</w:t>
+      </w:r>
+      <w:r>
+        <w:rPr>
+          <w:rFonts w:ascii="Arial" w:hAnsi="Arial" w:cs="Arial"/>
+        </w:rPr>
+        <w:t xml:space="preserve"> </w:t>
       </w:r>
     </w:p>
     <w:p>
       <w:pPr>
         <w:pStyle w:val="NormalWeb"/>
-        <w:spacing w:line="360" w:lineRule="auto"/>
-        <w:ind w:firstLine="360"/>
-        <w:jc w:val="both"/>
-        <w:rPr>
-          <w:rFonts w:ascii="Arial" w:hAnsi="Arial" w:cs="Arial"/>
-        </w:rPr>
-      </w:pPr>
-      <w:r>
-        <w:rPr>
-          <w:rFonts w:ascii="Arial" w:hAnsi="Arial" w:cs="Arial"/>
-        </w:rPr>
-        <w:t>Outro fator crucial é a equidade</w:t>
-      </w:r>
-      <w:r>
-        <w:rPr>
-          <w:rFonts w:ascii="Arial" w:hAnsi="Arial" w:cs="Arial"/>
-        </w:rPr>
-        <w:t>. A Pesquisa Game Brasil 2025 mostrou que pessoas de menor renda jogam principalmente no celular, e consoles e PCs gamer continuam concentrados nas classes mais altas.</w:t>
-      </w:r>
-      <w:r>
-        <w:rPr>
-          <w:rFonts w:ascii="Arial" w:hAnsi="Arial" w:cs="Arial"/>
-        </w:rPr>
-        <w:t xml:space="preserve"> Por isso,</w:t>
-      </w:r>
-      <w:r>
-        <w:rPr>
-          <w:rFonts w:ascii="Arial" w:hAnsi="Arial" w:cs="Arial"/>
-        </w:rPr>
-        <w:t xml:space="preserve"> </w:t>
-      </w:r>
-      <w:r>
-        <w:rPr>
-          <w:rFonts w:ascii="Arial" w:hAnsi="Arial" w:cs="Arial"/>
-        </w:rPr>
-        <w:t xml:space="preserve">é imperativo que todos os </w:t>
-      </w:r>
-      <w:r>
-        <w:rPr>
-          <w:rFonts w:ascii="Arial" w:hAnsi="Arial" w:cs="Arial"/>
-        </w:rPr>
-        <w:t>players</w:t>
-      </w:r>
-      <w:r>
-        <w:rPr>
-          <w:rFonts w:ascii="Arial" w:hAnsi="Arial" w:cs="Arial"/>
-        </w:rPr>
-        <w:t xml:space="preserve"> tenham acesso igualitário ao conteúdo, sem barreiras paywalls que segreguem os jogadores por poder aquisitivo</w:t>
-      </w:r>
-      <w:r>
-        <w:rPr>
-          <w:rFonts w:ascii="Arial" w:hAnsi="Arial" w:cs="Arial"/>
-        </w:rPr>
-        <w:t xml:space="preserve">, </w:t>
-      </w:r>
-      <w:r>
-        <w:rPr>
-          <w:rFonts w:ascii="Arial" w:hAnsi="Arial" w:cs="Arial"/>
-        </w:rPr>
-        <w:t>visto que isto fere qualquer valor ético presente na sociedade e fere a dignidade humana.</w:t>
-      </w:r>
-    </w:p>
-    <w:p>
-      <w:pPr>
-        <w:spacing w:line="360" w:lineRule="auto"/>
-      </w:pPr>
-    </w:p>
-    <w:p>
-      <w:pPr>
-        <w:pStyle w:val="Ttulo1"/>
-        <w:spacing w:before="240" w:after="120"/>
-        <w:rPr>
-          <w:caps/>
-        </w:rPr>
-      </w:pPr>
-    </w:p>
-    <w:p>
-      <w:pPr>
-        <w:pStyle w:val="Ttulo1"/>
-        <w:spacing w:before="240" w:after="120"/>
-        <w:rPr>
-          <w:caps/>
-        </w:rPr>
-      </w:pPr>
-    </w:p>
-    <w:p>
-      <w:pPr>
-        <w:pStyle w:val="Ttulo1"/>
-        <w:spacing w:before="240" w:after="120"/>
-        <w:rPr>
-          <w:caps/>
-        </w:rPr>
-      </w:pPr>
-    </w:p>
-    <w:p>
-      <w:pPr>
-        <w:pStyle w:val="Ttulo1"/>
-        <w:spacing w:before="240" w:after="120"/>
-        <w:rPr>
-          <w:caps/>
-        </w:rPr>
-      </w:pPr>
-    </w:p>
-    <w:p>
-      <w:pPr>
-        <w:pStyle w:val="Ttulo1"/>
-        <w:spacing w:before="240" w:after="120"/>
-        <w:rPr>
-          <w:caps/>
-        </w:rPr>
-      </w:pPr>
-    </w:p>
-    <w:p>
-      <w:pPr>
-        <w:pStyle w:val="Ttulo1"/>
-        <w:spacing w:before="240" w:after="120"/>
-        <w:rPr>
-          <w:caps/>
-        </w:rPr>
-      </w:pPr>
-    </w:p>
-    <w:p>
-      <w:pPr>
-        <w:pStyle w:val="Ttulo1"/>
-        <w:spacing w:before="240" w:after="120"/>
-        <w:rPr>
-          <w:caps/>
-        </w:rPr>
-      </w:pPr>
-    </w:p>
-    <w:p>
-      <w:pPr>
-        <w:pStyle w:val="Ttulo1"/>
-        <w:spacing w:before="240" w:after="120"/>
-        <w:rPr>
-          <w:caps/>
-        </w:rPr>
-      </w:pPr>
-    </w:p>
-    <w:p>
-      <w:pPr>
-        <w:pStyle w:val="Ttulo1"/>
-        <w:spacing w:before="240" w:after="120"/>
-      </w:pPr>
-      <w:r>
-        <w:rPr>
-          <w:caps/>
-        </w:rPr>
-        <w:lastRenderedPageBreak/>
-        <w:t>4 ACESSIBILIDADE E INCLUSÃO</w:t>
-      </w:r>
-    </w:p>
-    <w:p>
-      <w:pPr>
-        <w:pStyle w:val="Ttulo2"/>
-        <w:spacing w:before="240" w:after="120"/>
-      </w:pPr>
-      <w:r>
-        <w:t>4.1 Recursos Implementados e Planejados</w:t>
-      </w:r>
-    </w:p>
-    <w:p>
-      <w:pPr>
-        <w:ind w:firstLine="709"/>
-        <w:jc w:val="both"/>
-      </w:pPr>
-      <w:r>
-        <w:t>O Urban Chase possui premissas que favorecem a inclusão</w:t>
-      </w:r>
-      <w:r>
-        <w:t>, facilitada pela utilização de</w:t>
-      </w:r>
-      <w:r>
-        <w:t xml:space="preserve"> uma mecânica de "Controle Indireto"</w:t>
-      </w:r>
-      <w:r>
-        <w:t xml:space="preserve">, </w:t>
-      </w:r>
-      <w:r>
-        <w:t>que é um facilitador para jogadores com limitações motoras que não conseguem executar movimentos complexos de joysticks ou teclado em tempo real.</w:t>
-      </w:r>
-    </w:p>
-    <w:p>
-      <w:pPr>
-        <w:pStyle w:val="Ttulo2"/>
-        <w:spacing w:before="240" w:after="120"/>
-      </w:pPr>
-      <w:r>
-        <w:t>4.2 Estratégias de Acessibilidade</w:t>
-      </w:r>
-    </w:p>
-    <w:p>
-      <w:pPr>
-        <w:pStyle w:val="Ttulo3"/>
-        <w:spacing w:before="240" w:after="120"/>
-      </w:pPr>
-      <w:r>
-        <w:rPr>
-          <w:b/>
-        </w:rPr>
-        <w:t xml:space="preserve">4.2.1 </w:t>
-      </w:r>
-      <w:r>
-        <w:t>Visual e Cognitiva</w:t>
-      </w:r>
-    </w:p>
-    <w:p>
-      <w:pPr>
-        <w:ind w:firstLine="709"/>
-        <w:jc w:val="both"/>
-      </w:pPr>
-      <w:r>
-        <w:t>O jogo opera em um ambiente urbano 3D</w:t>
-      </w:r>
-      <w:r>
-        <w:t>.</w:t>
-      </w:r>
-      <w:r>
-        <w:t xml:space="preserve"> Para garantir inclusão a daltônicos e pessoas com baixa visão, o design de UI (Interface do </w:t>
-      </w:r>
-      <w:r>
-        <w:t>Usuário) adota</w:t>
-      </w:r>
-      <w:r>
-        <w:t xml:space="preserve"> padrões de alto contraste e dupla </w:t>
-      </w:r>
-      <w:r>
-        <w:t>codificação para</w:t>
-      </w:r>
-      <w:r>
-        <w:t xml:space="preserve"> indicar</w:t>
-      </w:r>
-      <w:r>
-        <w:t xml:space="preserve"> ações e colisões na tela, pois estes parâmetros facilitam a acessibilidade.</w:t>
-      </w:r>
-    </w:p>
-    <w:p>
-      <w:pPr>
-        <w:pStyle w:val="Ttulo3"/>
-        <w:spacing w:before="240" w:after="120"/>
-        <w:jc w:val="both"/>
-      </w:pPr>
-      <w:r>
-        <w:rPr>
-          <w:b/>
-        </w:rPr>
-        <w:t>4.2.2</w:t>
-      </w:r>
-      <w:r>
-        <w:t xml:space="preserve"> </w:t>
-      </w:r>
-      <w:r>
-        <w:t>Motorabilidade</w:t>
-      </w:r>
-    </w:p>
-    <w:p>
-      <w:pPr>
-        <w:ind w:firstLine="709"/>
-        <w:jc w:val="both"/>
-      </w:pPr>
-      <w:r>
-        <w:t>A mecânica de clicar para posicionar obstáculos é compatível com tecnologias assistivas, como head-trackers ou cliques adaptativos</w:t>
-      </w:r>
-      <w:r>
-        <w:t>, dado que estas ferramentas auxiliam pessoas com deficiências motoras a poderem disfrutar da experiência completa do jogo.</w:t>
-      </w:r>
-    </w:p>
-    <w:p>
-      <w:pPr>
-        <w:pStyle w:val="Ttulo3"/>
-        <w:spacing w:before="240" w:after="120"/>
-      </w:pPr>
-      <w:r>
-        <w:rPr>
-          <w:b/>
-        </w:rPr>
-        <w:t xml:space="preserve">4.2.3 </w:t>
-      </w:r>
-      <w:r>
-        <w:t>Feedback Sensorial:</w:t>
-      </w:r>
-    </w:p>
-    <w:p>
-      <w:pPr>
-        <w:ind w:firstLine="709"/>
-        <w:jc w:val="both"/>
-      </w:pPr>
-      <w:r>
-        <w:t>A ambientação sonora do jogo deve possuir legendas ou indicadores visuais para pistas sonoras essenciais, auxiliando jogadores com deficiência auditiva.</w:t>
-      </w:r>
-    </w:p>
-    <w:p>
-      <w:pPr>
-        <w:jc w:val="both"/>
-        <w:rPr>
-          <w:b/>
-        </w:rPr>
-      </w:pPr>
-    </w:p>
-    <w:p>
-      <w:pPr>
-        <w:jc w:val="both"/>
-        <w:rPr>
-          <w:b/>
-        </w:rPr>
-      </w:pPr>
-    </w:p>
-    <w:p>
-      <w:pPr>
-        <w:jc w:val="both"/>
-        <w:rPr>
-          <w:b/>
-        </w:rPr>
-      </w:pPr>
-      <w:r>
-        <w:rPr>
-          <w:b/>
-        </w:rPr>
-        <w:lastRenderedPageBreak/>
-        <w:t xml:space="preserve">4.2.4 </w:t>
-      </w:r>
-      <w:r>
-        <w:t>Conclusão</w:t>
-      </w:r>
-    </w:p>
-    <w:p>
-      <w:pPr>
-        <w:ind w:firstLine="708"/>
-        <w:jc w:val="both"/>
-      </w:pPr>
-      <w:r>
-        <w:t>Portanto</w:t>
-      </w:r>
-      <w:r>
-        <w:t xml:space="preserve">, </w:t>
-      </w:r>
-      <w:r>
-        <w:t xml:space="preserve">numa realidade de 14,4 milhões de pessoas com deficiência no Brasil, </w:t>
-      </w:r>
-      <w:r>
-        <w:t xml:space="preserve">o </w:t>
-      </w:r>
-      <w:r>
-        <w:t xml:space="preserve">Urban Chase </w:t>
-      </w:r>
-      <w:r>
-        <w:t xml:space="preserve">busca integrar recursos que permitam que </w:t>
-      </w:r>
-      <w:r>
-        <w:t>qualquer pessoa, independentemente de suas limitações físicas, possa</w:t>
-      </w:r>
-      <w:r>
-        <w:t xml:space="preserve"> controlar os personagens, devido ao compromisso ético que o jogo visa </w:t>
-      </w:r>
-      <w:r>
-        <w:t>utilizar e também implementar no pensamento dos players.</w:t>
-      </w:r>
-    </w:p>
-    <w:p/>
-    <w:p>
-      <w:pPr>
-        <w:pStyle w:val="Ttulo1"/>
-        <w:spacing w:before="240" w:after="120"/>
-        <w:rPr>
-          <w:caps/>
-        </w:rPr>
-      </w:pPr>
-    </w:p>
-    <w:p>
-      <w:pPr>
-        <w:pStyle w:val="Ttulo1"/>
-        <w:spacing w:before="240" w:after="120"/>
-        <w:rPr>
-          <w:caps/>
-        </w:rPr>
-      </w:pPr>
-    </w:p>
-    <w:p>
-      <w:pPr>
-        <w:pStyle w:val="Ttulo1"/>
-        <w:spacing w:before="240" w:after="120"/>
-        <w:rPr>
-          <w:caps/>
-        </w:rPr>
-      </w:pPr>
-    </w:p>
-    <w:p>
-      <w:pPr>
-        <w:pStyle w:val="Ttulo1"/>
-        <w:spacing w:before="240" w:after="120"/>
-        <w:rPr>
-          <w:caps/>
-        </w:rPr>
-      </w:pPr>
-    </w:p>
-    <w:p>
-      <w:pPr>
-        <w:pStyle w:val="Ttulo1"/>
-        <w:spacing w:before="240" w:after="120"/>
-        <w:rPr>
-          <w:caps/>
-        </w:rPr>
-      </w:pPr>
-    </w:p>
-    <w:p>
-      <w:pPr>
-        <w:pStyle w:val="Ttulo1"/>
-        <w:spacing w:before="240" w:after="120"/>
-        <w:rPr>
-          <w:caps/>
-        </w:rPr>
-      </w:pPr>
-    </w:p>
-    <w:p>
-      <w:pPr>
-        <w:pStyle w:val="Ttulo1"/>
-        <w:spacing w:before="240" w:after="120"/>
-        <w:rPr>
-          <w:caps/>
-        </w:rPr>
-      </w:pPr>
-    </w:p>
-    <w:p>
-      <w:pPr>
-        <w:pStyle w:val="Ttulo1"/>
-        <w:spacing w:before="240" w:after="120"/>
-        <w:rPr>
-          <w:caps/>
-        </w:rPr>
-      </w:pPr>
-    </w:p>
-    <w:p>
-      <w:pPr>
-        <w:pStyle w:val="Ttulo1"/>
-        <w:spacing w:before="240" w:after="120"/>
-        <w:rPr>
-          <w:caps/>
-        </w:rPr>
-      </w:pPr>
-    </w:p>
-    <w:p>
-      <w:pPr>
-        <w:pStyle w:val="Ttulo1"/>
-        <w:spacing w:before="240" w:after="120"/>
-        <w:rPr>
-          <w:caps/>
-        </w:rPr>
-      </w:pPr>
-    </w:p>
-    <w:p>
-      <w:pPr>
-        <w:pStyle w:val="Ttulo1"/>
-        <w:spacing w:before="240" w:after="120"/>
-        <w:rPr>
-          <w:caps/>
-        </w:rPr>
-      </w:pPr>
-    </w:p>
-    <w:p>
-      <w:pPr>
-        <w:pStyle w:val="Ttulo1"/>
-        <w:spacing w:before="240" w:after="120"/>
-        <w:rPr>
-          <w:caps/>
-        </w:rPr>
-      </w:pPr>
-    </w:p>
-    <w:p>
-      <w:pPr>
-        <w:pStyle w:val="Ttulo1"/>
-        <w:spacing w:before="240" w:after="120"/>
-        <w:rPr>
-          <w:caps/>
-        </w:rPr>
-      </w:pPr>
-    </w:p>
-    <w:p>
-      <w:pPr>
-        <w:pStyle w:val="Ttulo1"/>
-        <w:spacing w:before="240" w:after="120"/>
-      </w:pPr>
-      <w:r>
-        <w:rPr>
-          <w:caps/>
-        </w:rPr>
-        <w:lastRenderedPageBreak/>
-        <w:t>5 IMPACTO SOCIAL E COMPORTAMENTAL</w:t>
-      </w:r>
-    </w:p>
-    <w:p>
-      <w:pPr>
-        <w:pStyle w:val="Ttulo2"/>
-        <w:spacing w:before="240" w:after="120"/>
-      </w:pPr>
-      <w:r>
-        <w:t>5.1 O Jogo como Ferramenta de Educação e Transformação</w:t>
-      </w:r>
-    </w:p>
-    <w:p>
-      <w:pPr>
-        <w:ind w:firstLine="709"/>
-        <w:jc w:val="both"/>
-      </w:pPr>
-      <w:r>
-        <w:t xml:space="preserve">O principal diferencial do Urban Chase é sua proposta educativa </w:t>
-      </w:r>
-      <w:r>
-        <w:t>voltada</w:t>
-      </w:r>
-      <w:r>
-        <w:t xml:space="preserve"> a conscientização sobre a depredação do patrimônio público</w:t>
-      </w:r>
-      <w:r>
-        <w:t xml:space="preserve"> e sobre a perseguição policial, ainda mais dentro de uma indústria de games a qual possui lacunas de mercados totais endereçáveis voltados a estas ideias que integram a ética com a estimulação do fortalecimento do senso comum dos cidadãos voltados a tópicos presentes no seu meio.</w:t>
-      </w:r>
-    </w:p>
-    <w:p>
-      <w:pPr>
-        <w:pStyle w:val="Ttulo2"/>
-        <w:spacing w:before="240" w:after="120"/>
-      </w:pPr>
-      <w:r>
-        <w:t>5.2 Influência das Mecânicas no Comportamento</w:t>
-      </w:r>
-    </w:p>
-    <w:p>
-      <w:pPr>
-        <w:pStyle w:val="Ttulo3"/>
-        <w:spacing w:before="240" w:after="120"/>
-      </w:pPr>
-      <w:r>
-        <w:rPr>
-          <w:b/>
-        </w:rPr>
-        <w:t xml:space="preserve">5.2.1 </w:t>
-      </w:r>
-      <w:r>
-        <w:t>Empatia e Cidadania:</w:t>
-      </w:r>
-    </w:p>
-    <w:p>
-      <w:pPr>
-        <w:ind w:firstLine="709"/>
-        <w:jc w:val="both"/>
-      </w:pPr>
-      <w:r>
-        <w:t>Ao controlar o Detetive Daniel, o jogador irá dispor de estratégia e raciocínio tático para</w:t>
-      </w:r>
-      <w:r>
-        <w:t xml:space="preserve"> promove</w:t>
-      </w:r>
-      <w:r>
-        <w:t>r</w:t>
-      </w:r>
-      <w:r>
-        <w:t xml:space="preserve"> uma mudança de perspectiva sobre o vandalismo</w:t>
-      </w:r>
-      <w:r>
-        <w:t xml:space="preserve"> já dentro da experiência do game, pois o player, para conseguir concluir as fases dele, obrigatoriamente, entenderá o meio ético que o jogo apresenta, isto é, passa a compreender os danos da depredação do patrimônios e a falta de uma perseguição policial eficiente</w:t>
-      </w:r>
-      <w:r>
-        <w:t>, os quais podem ser dados de forma moral ou material</w:t>
-      </w:r>
-    </w:p>
-    <w:p>
-      <w:pPr>
-        <w:pStyle w:val="Ttulo3"/>
-        <w:spacing w:before="240" w:after="120"/>
-      </w:pPr>
-      <w:r>
-        <w:rPr>
-          <w:b/>
-        </w:rPr>
-        <w:t>5.2.2</w:t>
-      </w:r>
-      <w:r>
-        <w:t xml:space="preserve"> Resolução Não-Violenta de Conflitos:</w:t>
-      </w:r>
-    </w:p>
-    <w:p>
-      <w:pPr>
-        <w:ind w:firstLine="709"/>
-        <w:jc w:val="both"/>
-      </w:pPr>
-      <w:r>
-        <w:t>Além disso, a interação principal entre o Detetive Paul e o Bandido Daniel se dá pelo posicionamento tático de obstáculos (barreiras, cones, óleo), sugerindo que o intelecto e a estratégia são armas mais eficazes e éticas do que a violência, tão presente em casos de perseguição urbana.</w:t>
-      </w:r>
-    </w:p>
-    <w:p/>
-    <w:p>
-      <w:pPr>
-        <w:pStyle w:val="Ttulo2"/>
-        <w:spacing w:before="240" w:after="120"/>
-      </w:pPr>
-    </w:p>
-    <w:p>
-      <w:pPr>
-        <w:pStyle w:val="Ttulo2"/>
-        <w:spacing w:before="240" w:after="120"/>
-      </w:pPr>
-      <w:bookmarkStart w:id="0" w:name="_GoBack"/>
-      <w:bookmarkEnd w:id="0"/>
-      <w:r>
-        <w:lastRenderedPageBreak/>
-        <w:t>5.3 Conclusão do Impacto</w:t>
-      </w:r>
-    </w:p>
-    <w:p>
-      <w:pPr>
-        <w:ind w:firstLine="709"/>
-        <w:jc w:val="both"/>
-      </w:pPr>
-      <w:r>
-        <w:t>O Urban Chase  é um jogo que tem o potencial de atuar  sendo utilizado não apenas para lazer, mas como um instrumento lúdico em campanhas de educação patrimonial e cidadã, alinhando o desenvolvimento tecnológico ao bem-estar social, pois, na sociedade contemporânea não há a criação de games com imersões éticas, fator que permite o jogo não apenas ser um diferencial, mas também mudar a percepção de valor da sociedade sobre como a demolição da União e a falta de fiscalização no ramo de perseguição policial podem impactar sua vida, ainda mais em um cenário urbano.</w:t>
-      </w:r>
-    </w:p>
-    <w:p/>
-    <w:p>
-      <w:pPr>
-        <w:pStyle w:val="Ttulo1"/>
-        <w:spacing w:before="240" w:after="120"/>
-        <w:rPr>
-          <w:caps/>
-        </w:rPr>
-      </w:pPr>
-    </w:p>
-    <w:p>
-      <w:pPr>
-        <w:pStyle w:val="Ttulo1"/>
-        <w:spacing w:before="240" w:after="120"/>
-        <w:rPr>
-          <w:caps/>
-        </w:rPr>
-      </w:pPr>
-    </w:p>
-    <w:p>
-      <w:pPr>
-        <w:pStyle w:val="Ttulo1"/>
-        <w:spacing w:before="240" w:after="120"/>
-        <w:rPr>
-          <w:caps/>
-        </w:rPr>
-      </w:pPr>
-    </w:p>
-    <w:p>
-      <w:pPr>
-        <w:pStyle w:val="Ttulo1"/>
-        <w:spacing w:before="240" w:after="120"/>
-        <w:rPr>
-          <w:caps/>
-        </w:rPr>
-      </w:pPr>
-    </w:p>
-    <w:p>
-      <w:pPr>
-        <w:pStyle w:val="Ttulo1"/>
-        <w:spacing w:before="240" w:after="120"/>
-        <w:rPr>
-          <w:caps/>
-        </w:rPr>
-      </w:pPr>
-    </w:p>
-    <w:p>
-      <w:pPr>
-        <w:pStyle w:val="Ttulo1"/>
-        <w:spacing w:before="240" w:after="120"/>
-        <w:rPr>
-          <w:caps/>
-        </w:rPr>
-      </w:pPr>
-    </w:p>
-    <w:p>
-      <w:pPr>
-        <w:pStyle w:val="Ttulo1"/>
-        <w:spacing w:before="240" w:after="120"/>
-        <w:rPr>
-          <w:caps/>
-        </w:rPr>
-      </w:pPr>
-    </w:p>
-    <w:p>
-      <w:pPr>
-        <w:pStyle w:val="Ttulo1"/>
-        <w:spacing w:before="240" w:after="120"/>
-        <w:rPr>
-          <w:caps/>
-        </w:rPr>
-      </w:pPr>
-    </w:p>
-    <w:p>
-      <w:pPr>
-        <w:pStyle w:val="Ttulo1"/>
-        <w:spacing w:before="240" w:after="120"/>
-        <w:rPr>
-          <w:caps/>
-        </w:rPr>
-      </w:pPr>
-    </w:p>
-    <w:p>
-      <w:pPr>
-        <w:pStyle w:val="Ttulo1"/>
-        <w:spacing w:before="240" w:after="120"/>
-        <w:rPr>
-          <w:caps/>
-        </w:rPr>
-      </w:pPr>
-    </w:p>
-    <w:p>
-      <w:pPr>
-        <w:pStyle w:val="Ttulo1"/>
-        <w:spacing w:before="240" w:after="120"/>
-      </w:pPr>
-      <w:r>
-        <w:rPr>
-          <w:caps/>
-        </w:rPr>
-        <w:lastRenderedPageBreak/>
-        <w:t>6 CONCLUSÃO</w:t>
-      </w:r>
-    </w:p>
-    <w:p>
-      <w:pPr>
-        <w:ind w:firstLine="709"/>
-        <w:jc w:val="both"/>
-      </w:pPr>
-      <w:r>
-        <w:t>O desenvolvimento do Urban Chase transcende a aplicação técnica de C# e Unity, pois tem como intuito principal desenvolver uma maturidade ética ao evitar armadilhas de monetização predatória e ao priorizar a privacidade e a acessibilidade desde sua base.</w:t>
-      </w:r>
-    </w:p>
-    <w:p/>
-    <w:p>
-      <w:pPr>
-        <w:ind w:firstLine="709"/>
-        <w:jc w:val="both"/>
-      </w:pPr>
-      <w:r>
-        <w:t xml:space="preserve">Ao centralizar a jogabilidade na preservação do bem comum e no pensamento estratégico, o Urban Chase reafirma o papel do desenvolvedor como um agente de transformação social. </w:t>
-      </w:r>
-    </w:p>
-    <w:p>
-      <w:pPr>
-        <w:ind w:firstLine="709"/>
-        <w:jc w:val="both"/>
-      </w:pPr>
-      <w:r>
-        <w:t>Depreende-se, portanto, que o jogo não apenas entretém, mas convida o jogador a refletir sobre seu papel na sociedade, cumprindo o objetivo de criar tecnologia com consciência e responsabilidade.</w:t>
-      </w:r>
-    </w:p>
-    <w:p>
-      <w:r>
-        <w:br/>
-      </w:r>
-    </w:p>
-    <w:p>
-      <w:pPr>
-        <w:spacing w:after="480"/>
-        <w:rPr>
+        <w:spacing w:line="480" w:lineRule="auto"/>
+        <w:jc w:val="both"/>
+        <w:rPr>
+          <w:rFonts w:ascii="Arial" w:hAnsi="Arial" w:cs="Arial"/>
           <w:b/>
           <w:bCs/>
         </w:rPr>
       </w:pPr>
-    </w:p>
-    <w:p>
-      <w:pPr>
-        <w:spacing w:after="480"/>
-        <w:rPr>
+      <w:r>
+        <w:rPr>
+          <w:rFonts w:ascii="Arial" w:hAnsi="Arial" w:cs="Arial"/>
           <w:b/>
           <w:bCs/>
         </w:rPr>
-      </w:pPr>
-    </w:p>
-    <w:p>
-      <w:pPr>
-        <w:spacing w:after="480"/>
-        <w:rPr>
+        <w:t>Figura 2: Gráfico que mostra plataf</w:t>
+      </w:r>
+      <w:r>
+        <w:rPr>
+          <w:rFonts w:ascii="Arial" w:hAnsi="Arial" w:cs="Arial"/>
           <w:b/>
           <w:bCs/>
         </w:rPr>
-      </w:pPr>
-    </w:p>
-    <w:p>
-      <w:pPr>
-        <w:spacing w:after="480"/>
-        <w:rPr>
+        <w:t>ormas de jogos por faixa de renda</w:t>
+      </w:r>
+      <w:r>
+        <w:rPr>
+          <w:rFonts w:ascii="Arial" w:hAnsi="Arial" w:cs="Arial"/>
           <w:b/>
           <w:bCs/>
         </w:rPr>
-      </w:pPr>
-    </w:p>
-    <w:p>
-      <w:pPr>
-        <w:spacing w:after="480"/>
-        <w:rPr>
+        <w:t>.</w:t>
+      </w:r>
+    </w:p>
+    <w:p>
+      <w:pPr>
+        <w:pStyle w:val="NormalWeb"/>
+        <w:spacing w:line="480" w:lineRule="auto"/>
+        <w:ind w:firstLine="360"/>
+        <w:jc w:val="both"/>
+        <w:rPr>
+          <w:rFonts w:ascii="Arial" w:hAnsi="Arial" w:cs="Arial"/>
+        </w:rPr>
+      </w:pPr>
+      <w:r>
+        <w:rPr>
+          <w:rFonts w:ascii="Arial" w:hAnsi="Arial" w:cs="Arial"/>
+          <w:noProof/>
+        </w:rPr>
+        <w:drawing>
+          <wp:inline distT="0" distB="0" distL="0" distR="0" wp14:anchorId="3DEC3D4F" wp14:editId="65532091">
+            <wp:extent cx="5753100" cy="3495675"/>
+            <wp:effectExtent l="0" t="0" r="0" b="9525"/>
+            <wp:docPr id="4" name="Imagem 4"/>
+            <wp:cNvGraphicFramePr>
+              <a:graphicFrameLocks xmlns:a="http://schemas.openxmlformats.org/drawingml/2006/main" noChangeAspect="1"/>
+            </wp:cNvGraphicFramePr>
+            <a:graphic xmlns:a="http://schemas.openxmlformats.org/drawingml/2006/main">
+              <a:graphicData uri="http://schemas.openxmlformats.org/drawingml/2006/picture">
+                <pic:pic xmlns:pic="http://schemas.openxmlformats.org/drawingml/2006/picture">
+                  <pic:nvPicPr>
+                    <pic:cNvPr id="0" name="Picture 5"/>
+                    <pic:cNvPicPr>
+                      <a:picLocks noChangeAspect="1" noChangeArrowheads="1"/>
+                    </pic:cNvPicPr>
+                  </pic:nvPicPr>
+                  <pic:blipFill>
+                    <a:blip r:embed="rId11" cstate="print">
+                      <a:extLst>
+                        <a:ext uri="{28A0092B-C50C-407E-A947-70E740481C1C}">
+                          <a14:useLocalDpi xmlns:a14="http://schemas.microsoft.com/office/drawing/2010/main" val="0"/>
+                        </a:ext>
+                      </a:extLst>
+                    </a:blip>
+                    <a:srcRect/>
+                    <a:stretch>
+                      <a:fillRect/>
+                    </a:stretch>
+                  </pic:blipFill>
+                  <pic:spPr bwMode="auto">
+                    <a:xfrm>
+                      <a:off x="0" y="0"/>
+                      <a:ext cx="5753100" cy="3495675"/>
+                    </a:xfrm>
+                    <a:prstGeom prst="rect">
+                      <a:avLst/>
+                    </a:prstGeom>
+                    <a:noFill/>
+                    <a:ln>
+                      <a:noFill/>
+                    </a:ln>
+                  </pic:spPr>
+                </pic:pic>
+              </a:graphicData>
+            </a:graphic>
+          </wp:inline>
+        </w:drawing>
+      </w:r>
+    </w:p>
+    <w:p>
+      <w:pPr>
+        <w:pStyle w:val="NormalWeb"/>
+        <w:spacing w:line="480" w:lineRule="auto"/>
+        <w:ind w:firstLine="360"/>
+        <w:jc w:val="both"/>
+        <w:rPr>
+          <w:rFonts w:ascii="Arial" w:hAnsi="Arial" w:cs="Arial"/>
+        </w:rPr>
+      </w:pPr>
+      <w:r>
+        <w:rPr>
+          <w:rFonts w:ascii="Arial" w:hAnsi="Arial" w:cs="Arial"/>
+        </w:rPr>
+        <w:t>Por isso,</w:t>
+      </w:r>
+      <w:r>
+        <w:rPr>
+          <w:rFonts w:ascii="Arial" w:hAnsi="Arial" w:cs="Arial"/>
+        </w:rPr>
+        <w:t xml:space="preserve"> </w:t>
+      </w:r>
+      <w:r>
+        <w:rPr>
+          <w:rFonts w:ascii="Arial" w:hAnsi="Arial" w:cs="Arial"/>
+        </w:rPr>
+        <w:t xml:space="preserve">é imperativo que todos os </w:t>
+      </w:r>
+      <w:r>
+        <w:rPr>
+          <w:rFonts w:ascii="Arial" w:hAnsi="Arial" w:cs="Arial"/>
+        </w:rPr>
+        <w:t>players</w:t>
+      </w:r>
+      <w:r>
+        <w:rPr>
+          <w:rFonts w:ascii="Arial" w:hAnsi="Arial" w:cs="Arial"/>
+        </w:rPr>
+        <w:t xml:space="preserve"> tenham acesso igualitário ao conteúdo, sem barreiras paywalls que segreguem os jogadores por poder aquisitivo</w:t>
+      </w:r>
+      <w:r>
+        <w:rPr>
+          <w:rFonts w:ascii="Arial" w:hAnsi="Arial" w:cs="Arial"/>
+        </w:rPr>
+        <w:t xml:space="preserve">, </w:t>
+      </w:r>
+      <w:r>
+        <w:rPr>
+          <w:rFonts w:ascii="Arial" w:hAnsi="Arial" w:cs="Arial"/>
+        </w:rPr>
+        <w:t>visto que isto fere qualquer valor ético presente na sociedade e fere a dignidade humana.</w:t>
+      </w:r>
+    </w:p>
+    <w:p>
+      <w:pPr>
+        <w:pStyle w:val="NormalWeb"/>
+        <w:spacing w:line="480" w:lineRule="auto"/>
+        <w:jc w:val="both"/>
+        <w:rPr>
+          <w:rFonts w:ascii="Arial" w:hAnsi="Arial" w:cs="Arial"/>
+        </w:rPr>
+      </w:pPr>
+      <w:r>
+        <w:rPr>
+          <w:rFonts w:ascii="Arial" w:hAnsi="Arial" w:cs="Arial"/>
           <w:b/>
           <w:bCs/>
-        </w:rPr>
-      </w:pPr>
-    </w:p>
-    <w:p>
-      <w:pPr>
-        <w:spacing w:after="480"/>
+          <w:caps/>
+        </w:rPr>
+        <w:t>4 ACESSIBILIDADE E INCLUSÃO</w:t>
+      </w:r>
+    </w:p>
+    <w:p>
+      <w:pPr>
+        <w:pStyle w:val="Forte1"/>
+      </w:pPr>
+      <w:r>
+        <w:t>4.1 Recursos Implementados e Planejados</w:t>
+      </w:r>
+    </w:p>
+    <w:p>
+      <w:pPr>
+        <w:ind w:firstLine="709"/>
+        <w:jc w:val="both"/>
+      </w:pPr>
+      <w:r>
+        <w:t>O Urban Chase possui premissas que favorecem a inclusão</w:t>
+      </w:r>
+      <w:r>
+        <w:t>, facilitada pela utilização de</w:t>
+      </w:r>
+      <w:r>
+        <w:t xml:space="preserve"> uma mecânica de "Controle Indireto"</w:t>
+      </w:r>
+      <w:r>
+        <w:t xml:space="preserve">, </w:t>
+      </w:r>
+      <w:r>
+        <w:t>que é um facilitador para jogadores com limitações motoras que não conseguem executar movimentos complexos de joysticks ou teclado em tempo real.</w:t>
+      </w:r>
+    </w:p>
+    <w:p>
+      <w:pPr>
+        <w:pStyle w:val="Forte1"/>
+      </w:pPr>
+      <w:r>
+        <w:lastRenderedPageBreak/>
+        <w:t>4.2 Estratégias de Acessibilidade</w:t>
+      </w:r>
+    </w:p>
+    <w:p>
+      <w:pPr>
+        <w:pStyle w:val="Forte1"/>
+      </w:pPr>
+      <w:r>
+        <w:t xml:space="preserve">4.2.1 </w:t>
+      </w:r>
+      <w:r>
+        <w:t>Visual e Cognitiva</w:t>
+      </w:r>
+    </w:p>
+    <w:p>
+      <w:pPr>
+        <w:ind w:firstLine="709"/>
+        <w:jc w:val="both"/>
+      </w:pPr>
+      <w:r>
+        <w:t>O jogo opera em um ambiente urbano 3D</w:t>
+      </w:r>
+      <w:r>
+        <w:t>.</w:t>
+      </w:r>
+      <w:r>
+        <w:t xml:space="preserve"> Para garantir inclusão a daltônicos e pessoas com baixa visão, o design de UI (Interface do </w:t>
+      </w:r>
+      <w:r>
+        <w:t>Usuário) adota</w:t>
+      </w:r>
+      <w:r>
+        <w:t xml:space="preserve"> padrões de alto contraste e dupla </w:t>
+      </w:r>
+      <w:r>
+        <w:t>codificação para</w:t>
+      </w:r>
+      <w:r>
+        <w:t xml:space="preserve"> indicar</w:t>
+      </w:r>
+      <w:r>
+        <w:t xml:space="preserve"> ações e colisões na tela, pois estes parâmetros facilitam a acessibilidade.</w:t>
+      </w:r>
+    </w:p>
+    <w:p>
+      <w:pPr>
+        <w:pStyle w:val="Forte1"/>
+      </w:pPr>
+      <w:r>
+        <w:t>4.2.2</w:t>
+      </w:r>
+      <w:r>
+        <w:t xml:space="preserve"> </w:t>
+      </w:r>
+      <w:r>
+        <w:t>Motorabilidade</w:t>
+      </w:r>
+    </w:p>
+    <w:p>
+      <w:pPr>
+        <w:ind w:firstLine="709"/>
+        <w:jc w:val="both"/>
+      </w:pPr>
+      <w:r>
+        <w:t>A mecânica de clicar para posicionar obstáculos é compatível com tecnologias assistivas, como head-trackers ou cliques adaptativos</w:t>
+      </w:r>
+      <w:r>
+        <w:t>, dado que estas ferramentas auxiliam pessoas com deficiências motoras a poderem disfrutar da experiência completa do jogo.</w:t>
+      </w:r>
+    </w:p>
+    <w:p>
+      <w:pPr>
+        <w:pStyle w:val="Forte1"/>
+      </w:pPr>
+      <w:r>
+        <w:t xml:space="preserve">4.2.3 </w:t>
+      </w:r>
+      <w:r>
+        <w:t>Feedback Sensorial:</w:t>
+      </w:r>
+    </w:p>
+    <w:p>
+      <w:pPr>
+        <w:ind w:firstLine="709"/>
+        <w:jc w:val="both"/>
+      </w:pPr>
+      <w:r>
+        <w:t>A ambientação sonora do jogo deve possuir legendas ou indicadores visuais para pistas sonoras essenciais, auxiliando jogadores com deficiência auditiva.</w:t>
+      </w:r>
+    </w:p>
+    <w:p>
+      <w:pPr>
+        <w:jc w:val="both"/>
+        <w:rPr>
+          <w:b/>
+        </w:rPr>
+      </w:pPr>
+    </w:p>
+    <w:p>
+      <w:pPr>
+        <w:jc w:val="both"/>
+        <w:rPr>
+          <w:b/>
+        </w:rPr>
+      </w:pPr>
+      <w:r>
+        <w:rPr>
+          <w:b/>
+        </w:rPr>
+        <w:t xml:space="preserve">4.2.4 </w:t>
+      </w:r>
+      <w:r>
         <w:rPr>
           <w:b/>
           <w:bCs/>
         </w:rPr>
-      </w:pPr>
-    </w:p>
-    <w:p>
-      <w:pPr>
-        <w:spacing w:after="480"/>
-      </w:pPr>
-      <w:r>
+        <w:t>Conclusão</w:t>
+      </w:r>
+    </w:p>
+    <w:p>
+      <w:pPr>
+        <w:ind w:firstLine="708"/>
+        <w:jc w:val="both"/>
+      </w:pPr>
+      <w:r>
+        <w:t>Portanto</w:t>
+      </w:r>
+      <w:r>
+        <w:t xml:space="preserve">, </w:t>
+      </w:r>
+      <w:r>
+        <w:t xml:space="preserve">numa realidade de 14,4 milhões de pessoas com deficiência no Brasil, </w:t>
+      </w:r>
+      <w:r>
+        <w:t xml:space="preserve">o </w:t>
+      </w:r>
+      <w:r>
+        <w:t xml:space="preserve">Urban Chase </w:t>
+      </w:r>
+      <w:r>
+        <w:t xml:space="preserve">busca integrar recursos que permitam que </w:t>
+      </w:r>
+      <w:r>
+        <w:t>qualquer pessoa, independentemente de suas limitações físicas, possa</w:t>
+      </w:r>
+      <w:r>
+        <w:t xml:space="preserve"> controlar os personagens, devido ao compromisso ético que o jogo visa </w:t>
+      </w:r>
+      <w:r>
+        <w:t>utilizar e também implementar no pensamento dos players.</w:t>
+      </w:r>
+    </w:p>
+    <w:p>
+      <w:pPr>
+        <w:ind w:firstLine="708"/>
+        <w:jc w:val="both"/>
         <w:rPr>
           <w:b/>
           <w:bCs/>
         </w:rPr>
+      </w:pPr>
+      <w:r>
+        <w:rPr>
+          <w:b/>
+          <w:bCs/>
+        </w:rPr>
+        <w:t>Figura 3: Gráfico sobre pessoas com deficiência no Brasil</w:t>
+      </w:r>
+    </w:p>
+    <w:p>
+      <w:pPr>
+        <w:ind w:firstLine="708"/>
+        <w:jc w:val="both"/>
+      </w:pPr>
+      <w:r>
+        <w:rPr>
+          <w:noProof/>
+        </w:rPr>
+        <w:drawing>
+          <wp:inline distT="0" distB="0" distL="0" distR="0" wp14:anchorId="6554BE4D" wp14:editId="013916BB">
+            <wp:extent cx="5753100" cy="3476625"/>
+            <wp:effectExtent l="0" t="0" r="0" b="9525"/>
+            <wp:docPr id="6" name="Imagem 6"/>
+            <wp:cNvGraphicFramePr>
+              <a:graphicFrameLocks xmlns:a="http://schemas.openxmlformats.org/drawingml/2006/main" noChangeAspect="1"/>
+            </wp:cNvGraphicFramePr>
+            <a:graphic xmlns:a="http://schemas.openxmlformats.org/drawingml/2006/main">
+              <a:graphicData uri="http://schemas.openxmlformats.org/drawingml/2006/picture">
+                <pic:pic xmlns:pic="http://schemas.openxmlformats.org/drawingml/2006/picture">
+                  <pic:nvPicPr>
+                    <pic:cNvPr id="0" name="Picture 7"/>
+                    <pic:cNvPicPr>
+                      <a:picLocks noChangeAspect="1" noChangeArrowheads="1"/>
+                    </pic:cNvPicPr>
+                  </pic:nvPicPr>
+                  <pic:blipFill>
+                    <a:blip r:embed="rId12" cstate="print">
+                      <a:extLst>
+                        <a:ext uri="{28A0092B-C50C-407E-A947-70E740481C1C}">
+                          <a14:useLocalDpi xmlns:a14="http://schemas.microsoft.com/office/drawing/2010/main" val="0"/>
+                        </a:ext>
+                      </a:extLst>
+                    </a:blip>
+                    <a:srcRect/>
+                    <a:stretch>
+                      <a:fillRect/>
+                    </a:stretch>
+                  </pic:blipFill>
+                  <pic:spPr bwMode="auto">
+                    <a:xfrm>
+                      <a:off x="0" y="0"/>
+                      <a:ext cx="5753100" cy="3476625"/>
+                    </a:xfrm>
+                    <a:prstGeom prst="rect">
+                      <a:avLst/>
+                    </a:prstGeom>
+                    <a:noFill/>
+                    <a:ln>
+                      <a:noFill/>
+                    </a:ln>
+                  </pic:spPr>
+                </pic:pic>
+              </a:graphicData>
+            </a:graphic>
+          </wp:inline>
+        </w:drawing>
+      </w:r>
+    </w:p>
+    <w:p>
+      <w:pPr>
+        <w:pStyle w:val="Forte1"/>
+      </w:pPr>
+      <w:r>
+        <w:t>5 IMPACTO SOCIAL E COMPORTAMENTAL</w:t>
+      </w:r>
+    </w:p>
+    <w:p>
+      <w:pPr>
+        <w:pStyle w:val="Forte1"/>
+      </w:pPr>
+      <w:r>
+        <w:t>5.1 O Jogo como Ferramenta de Educação e Transformação</w:t>
+      </w:r>
+    </w:p>
+    <w:p>
+      <w:pPr>
+        <w:ind w:firstLine="709"/>
+        <w:jc w:val="both"/>
+      </w:pPr>
+      <w:r>
+        <w:t xml:space="preserve">O principal diferencial do Urban Chase é sua proposta educativa </w:t>
+      </w:r>
+      <w:r>
+        <w:t>voltada</w:t>
+      </w:r>
+      <w:r>
+        <w:t xml:space="preserve"> a conscientização sobre a depredação do patrimônio público</w:t>
+      </w:r>
+      <w:r>
+        <w:t xml:space="preserve"> e sobre a perseguição policial, ainda mais dentro de uma indústria de games a qual possui lacunas de mercados totais endereçáveis voltados a estas ideias que integram a ética com a estimulação do fortalecimento do senso comum dos cidadãos voltados a tópicos presentes no seu meio.</w:t>
+      </w:r>
+    </w:p>
+    <w:p>
+      <w:pPr>
+        <w:pStyle w:val="Forte1"/>
+      </w:pPr>
+      <w:r>
+        <w:t>5.2 Influência das Mecânicas no Comportamento</w:t>
+      </w:r>
+    </w:p>
+    <w:p>
+      <w:pPr>
+        <w:pStyle w:val="Forte1"/>
+      </w:pPr>
+      <w:r>
         <w:lastRenderedPageBreak/>
+        <w:t>5.2.1 Empatia e Cidadania:</w:t>
+      </w:r>
+    </w:p>
+    <w:p>
+      <w:pPr>
+        <w:ind w:firstLine="709"/>
+        <w:jc w:val="both"/>
+      </w:pPr>
+      <w:r>
+        <w:t>Ao controlar o Detetive Daniel, o jogador irá dispor de estratégia e raciocínio tático para</w:t>
+      </w:r>
+      <w:r>
+        <w:t xml:space="preserve"> promove</w:t>
+      </w:r>
+      <w:r>
+        <w:t>r</w:t>
+      </w:r>
+      <w:r>
+        <w:t xml:space="preserve"> uma mudança de perspectiva sobre o vandalismo</w:t>
+      </w:r>
+      <w:r>
+        <w:t xml:space="preserve"> já dentro da experiência do game, pois o player, para conseguir concluir as fases dele, obrigatoriamente, entenderá o meio ético que o jogo apresenta, isto é, passa a compreender os danos da depredação do patrimônios e a falta de uma perseguição policial eficiente</w:t>
+      </w:r>
+      <w:r>
+        <w:t>, os quais podem ser dados de forma moral ou material</w:t>
+      </w:r>
+      <w:r>
+        <w:t>.</w:t>
+      </w:r>
+    </w:p>
+    <w:p>
+      <w:pPr>
+        <w:pStyle w:val="Forte1"/>
+      </w:pPr>
+      <w:r>
+        <w:t>5.2.2</w:t>
+      </w:r>
+      <w:r>
+        <w:t xml:space="preserve"> Resolução Não-Violenta de Conflitos:</w:t>
+      </w:r>
+    </w:p>
+    <w:p>
+      <w:pPr>
+        <w:ind w:firstLine="709"/>
+        <w:jc w:val="both"/>
+      </w:pPr>
+      <w:r>
+        <w:t>Além disso, a interação principal entre o Detetive Paul e o Bandido Daniel se dá pelo posicionamento tático de obstáculos (barreiras, cones, óleo), sugerindo que o intelecto e a estratégia são armas mais eficazes e éticas do que a violência, tão presente em casos de perseguição urbana.</w:t>
+      </w:r>
+    </w:p>
+    <w:p>
+      <w:pPr>
+        <w:pStyle w:val="Forte1"/>
+      </w:pPr>
+      <w:r>
+        <w:t>5.3 Conclusão do Impacto</w:t>
+      </w:r>
+    </w:p>
+    <w:p>
+      <w:pPr>
+        <w:ind w:firstLine="709"/>
+        <w:jc w:val="both"/>
+      </w:pPr>
+      <w:r>
+        <w:lastRenderedPageBreak/>
+        <w:t>O Urban Chase  é um jogo que tem o potencial de atuar  sendo utilizado não apenas para lazer, mas como um instrumento lúdico em campanhas de educação patrimonial e cidadã, alinhando o desenvolvimento tecnológico ao bem-estar social, pois, na sociedade contemporânea não há a criação de games com imersões éticas, fator que permite o jogo não apenas ser um diferencial, mas também mudar a percepção de valor da sociedade sobre como a demolição da União e a falta de fiscalização no ramo de perseguição policial podem impactar sua vida, ainda mais em um cenário urbano.</w:t>
+      </w:r>
+    </w:p>
+    <w:p>
+      <w:pPr>
+        <w:pStyle w:val="Forte1"/>
+      </w:pPr>
+    </w:p>
+    <w:p>
+      <w:pPr>
+        <w:pStyle w:val="Forte1"/>
+      </w:pPr>
+    </w:p>
+    <w:p>
+      <w:pPr>
+        <w:pStyle w:val="Forte1"/>
+      </w:pPr>
+    </w:p>
+    <w:p>
+      <w:pPr>
+        <w:pStyle w:val="Forte1"/>
+      </w:pPr>
+      <w:r>
+        <w:t>6 CONCLUSÃO</w:t>
+      </w:r>
+    </w:p>
+    <w:p>
+      <w:pPr>
+        <w:ind w:firstLine="709"/>
+        <w:jc w:val="both"/>
+      </w:pPr>
+      <w:r>
+        <w:t>O desenvolvimento do Urban Chase transcende a aplicação técnica de C# e Unity, pois tem como intuito principal desenvolver uma maturidade ética ao evitar armadilhas de monetização predatória e ao priorizar a privacidade e a acessibilidade desde sua base.</w:t>
+      </w:r>
+    </w:p>
+    <w:p>
+      <w:pPr>
+        <w:ind w:firstLine="709"/>
+        <w:jc w:val="both"/>
+      </w:pPr>
+      <w:r>
+        <w:t xml:space="preserve">Ao centralizar a jogabilidade na preservação do bem comum e no pensamento estratégico, o Urban Chase reafirma o papel do desenvolvedor como um agente de transformação social. </w:t>
+      </w:r>
+    </w:p>
+    <w:p>
+      <w:pPr>
+        <w:ind w:firstLine="709"/>
+        <w:jc w:val="both"/>
+      </w:pPr>
+      <w:r>
+        <w:t>Depreende-se, portanto, que o jogo não apenas entretém, mas convida o jogador a refletir sobre seu papel na sociedade, cumprindo o objetivo de criar tecnologia com consciência e responsabilidade.</w:t>
+      </w:r>
+    </w:p>
+    <w:p>
+      <w:r>
+        <w:lastRenderedPageBreak/>
+        <w:br/>
+      </w:r>
+    </w:p>
+    <w:p>
+      <w:pPr>
+        <w:spacing w:after="480"/>
+        <w:jc w:val="center"/>
+        <w:rPr>
+          <w:b/>
+          <w:bCs/>
+        </w:rPr>
+      </w:pPr>
+    </w:p>
+    <w:p>
+      <w:pPr>
+        <w:spacing w:after="480"/>
+        <w:jc w:val="center"/>
+        <w:rPr>
+          <w:b/>
+          <w:bCs/>
+        </w:rPr>
+      </w:pPr>
+    </w:p>
+    <w:p>
+      <w:pPr>
+        <w:spacing w:after="480"/>
+        <w:jc w:val="center"/>
+        <w:rPr>
+          <w:b/>
+          <w:bCs/>
+        </w:rPr>
+      </w:pPr>
+    </w:p>
+    <w:p>
+      <w:pPr>
+        <w:spacing w:after="480"/>
+        <w:jc w:val="center"/>
+        <w:rPr>
+          <w:b/>
+          <w:bCs/>
+        </w:rPr>
+      </w:pPr>
+    </w:p>
+    <w:p>
+      <w:pPr>
+        <w:spacing w:after="480"/>
+        <w:jc w:val="center"/>
+        <w:rPr>
+          <w:b/>
+          <w:bCs/>
+        </w:rPr>
+      </w:pPr>
+    </w:p>
+    <w:p>
+      <w:pPr>
+        <w:spacing w:after="480"/>
+        <w:jc w:val="center"/>
+        <w:rPr>
+          <w:b/>
+          <w:bCs/>
+        </w:rPr>
+      </w:pPr>
+    </w:p>
+    <w:p>
+      <w:pPr>
+        <w:spacing w:after="480"/>
+        <w:jc w:val="center"/>
+        <w:rPr>
+          <w:b/>
+          <w:bCs/>
+        </w:rPr>
+      </w:pPr>
+    </w:p>
+    <w:p>
+      <w:pPr>
+        <w:spacing w:after="480"/>
+        <w:jc w:val="center"/>
+      </w:pPr>
+      <w:r>
+        <w:rPr>
+          <w:b/>
+          <w:bCs/>
+        </w:rPr>
         <w:t>REFERÊNCIAS</w:t>
       </w:r>
     </w:p>
@@ -2063,6 +1911,7 @@
         <w:jc w:val="both"/>
       </w:pPr>
       <w:r>
+        <w:lastRenderedPageBreak/>
         <w:t>BRASIL. Lei nº 13.709, de 14 de agosto de 2018 (Lei Geral de Proteção de Dados Pessoais - LGPD). Diário Oficial [da] República Federativa do Brasil, Brasília, DF, 14 ago. 2018.</w:t>
       </w:r>
     </w:p>
@@ -2073,79 +1922,7 @@
         <w:jc w:val="both"/>
       </w:pPr>
       <w:r>
-        <w:t xml:space="preserve">DRUMMOND, A.; SAUER, J.D. </w:t>
-      </w:r>
-      <w:proofErr w:type="spellStart"/>
-      <w:r>
-        <w:t>Video</w:t>
-      </w:r>
-      <w:proofErr w:type="spellEnd"/>
-      <w:r>
-        <w:t xml:space="preserve"> game </w:t>
-      </w:r>
-      <w:proofErr w:type="spellStart"/>
-      <w:r>
-        <w:t>loot</w:t>
-      </w:r>
-      <w:proofErr w:type="spellEnd"/>
-      <w:r>
-        <w:t xml:space="preserve"> boxes are </w:t>
-      </w:r>
-      <w:proofErr w:type="spellStart"/>
-      <w:r>
-        <w:t>psychologically</w:t>
-      </w:r>
-      <w:proofErr w:type="spellEnd"/>
-      <w:r>
-        <w:t xml:space="preserve"> </w:t>
-      </w:r>
-      <w:proofErr w:type="spellStart"/>
-      <w:r>
-        <w:t>akin</w:t>
-      </w:r>
-      <w:proofErr w:type="spellEnd"/>
-      <w:r>
-        <w:t xml:space="preserve"> </w:t>
-      </w:r>
-      <w:proofErr w:type="spellStart"/>
-      <w:r>
-        <w:t>to</w:t>
-      </w:r>
-      <w:proofErr w:type="spellEnd"/>
-      <w:r>
-        <w:t xml:space="preserve"> </w:t>
-      </w:r>
-      <w:proofErr w:type="spellStart"/>
-      <w:r>
-        <w:t>gambling</w:t>
-      </w:r>
-      <w:proofErr w:type="spellEnd"/>
-      <w:r>
-        <w:t xml:space="preserve">. </w:t>
-      </w:r>
-      <w:proofErr w:type="spellStart"/>
-      <w:r>
-        <w:t>Nature</w:t>
-      </w:r>
-      <w:proofErr w:type="spellEnd"/>
-      <w:r>
-        <w:t xml:space="preserve"> </w:t>
-      </w:r>
-      <w:proofErr w:type="spellStart"/>
-      <w:r>
-        <w:t>Human</w:t>
-      </w:r>
-      <w:proofErr w:type="spellEnd"/>
-      <w:r>
-        <w:t xml:space="preserve"> </w:t>
-      </w:r>
-      <w:proofErr w:type="spellStart"/>
-      <w:r>
-        <w:t>Behaviour</w:t>
-      </w:r>
-      <w:proofErr w:type="spellEnd"/>
-      <w:r>
-        <w:t>, v. 2, n. 7, p. 530-533, 2018.</w:t>
+        <w:t>DRUMMOND, A.; SAUER, J.D. Video game loot boxes are psychologically akin to gambling. Nature Human Behaviour, v. 2, n. 7, p. 530-533, 2018.</w:t>
       </w:r>
     </w:p>
     <w:p>
@@ -2155,23 +1932,7 @@
         <w:jc w:val="both"/>
       </w:pPr>
       <w:r>
-        <w:t xml:space="preserve">MICROSOFT. Xbox </w:t>
-      </w:r>
-      <w:proofErr w:type="spellStart"/>
-      <w:r>
-        <w:t>Accessibility</w:t>
-      </w:r>
-      <w:proofErr w:type="spellEnd"/>
-      <w:r>
-        <w:t xml:space="preserve"> </w:t>
-      </w:r>
-      <w:proofErr w:type="spellStart"/>
-      <w:r>
-        <w:t>Guidelines</w:t>
-      </w:r>
-      <w:proofErr w:type="spellEnd"/>
-      <w:r>
-        <w:t>. Disponível em: https://www.xbox.com/en-US/accessibility. Acesso em: maio 2026.</w:t>
+        <w:t>INSTITUTO BRASILEIRO DE GEOGRAFIA E ESTATÍSTICA. Censo Demográfico 2022. Rio de Janeiro: IBGE, 2023.</w:t>
       </w:r>
     </w:p>
     <w:p>
@@ -2181,71 +1942,7 @@
         <w:jc w:val="both"/>
       </w:pPr>
       <w:r>
-        <w:t xml:space="preserve">NAUGHTY DOG. The </w:t>
-      </w:r>
-      <w:proofErr w:type="spellStart"/>
-      <w:r>
-        <w:t>Last</w:t>
-      </w:r>
-      <w:proofErr w:type="spellEnd"/>
-      <w:r>
-        <w:t xml:space="preserve"> </w:t>
-      </w:r>
-      <w:proofErr w:type="spellStart"/>
-      <w:r>
-        <w:t>of</w:t>
-      </w:r>
-      <w:proofErr w:type="spellEnd"/>
-      <w:r>
-        <w:t xml:space="preserve"> </w:t>
-      </w:r>
-      <w:proofErr w:type="spellStart"/>
-      <w:r>
-        <w:t>Us</w:t>
-      </w:r>
-      <w:proofErr w:type="spellEnd"/>
-      <w:r>
-        <w:t xml:space="preserve"> </w:t>
-      </w:r>
-      <w:proofErr w:type="spellStart"/>
-      <w:r>
-        <w:t>Part</w:t>
-      </w:r>
-      <w:proofErr w:type="spellEnd"/>
-      <w:r>
-        <w:t xml:space="preserve"> II - </w:t>
-      </w:r>
-      <w:proofErr w:type="spellStart"/>
-      <w:r>
-        <w:t>Accessibility</w:t>
-      </w:r>
-      <w:proofErr w:type="spellEnd"/>
-      <w:r>
-        <w:t xml:space="preserve"> </w:t>
-      </w:r>
-      <w:proofErr w:type="spellStart"/>
-      <w:r>
-        <w:t>Features</w:t>
-      </w:r>
-      <w:proofErr w:type="spellEnd"/>
-      <w:r>
-        <w:t xml:space="preserve">. Sony </w:t>
-      </w:r>
-      <w:proofErr w:type="spellStart"/>
-      <w:r>
-        <w:t>Interactive</w:t>
-      </w:r>
-      <w:proofErr w:type="spellEnd"/>
-      <w:r>
-        <w:t xml:space="preserve"> </w:t>
-      </w:r>
-      <w:proofErr w:type="spellStart"/>
-      <w:r>
-        <w:t>Entertainment</w:t>
-      </w:r>
-      <w:proofErr w:type="spellEnd"/>
-      <w:r>
-        <w:t>, 2020.</w:t>
+        <w:t>MASSACHUSETTS INSTITUTE OF TECHNOLOGY. Data Breach Report. Cambridge: MIT, 2024.</w:t>
       </w:r>
     </w:p>
     <w:p>
@@ -2255,47 +1952,7 @@
         <w:jc w:val="both"/>
       </w:pPr>
       <w:r>
-        <w:t xml:space="preserve">NINTENDO. </w:t>
-      </w:r>
-      <w:proofErr w:type="spellStart"/>
-      <w:r>
-        <w:t>Nintendo's</w:t>
-      </w:r>
-      <w:proofErr w:type="spellEnd"/>
-      <w:r>
-        <w:t xml:space="preserve"> Approach </w:t>
-      </w:r>
-      <w:proofErr w:type="spellStart"/>
-      <w:r>
-        <w:t>to</w:t>
-      </w:r>
-      <w:proofErr w:type="spellEnd"/>
-      <w:r>
-        <w:t xml:space="preserve"> Online </w:t>
-      </w:r>
-      <w:proofErr w:type="spellStart"/>
-      <w:r>
-        <w:t>Safety</w:t>
-      </w:r>
-      <w:proofErr w:type="spellEnd"/>
-      <w:r>
-        <w:t xml:space="preserve"> </w:t>
-      </w:r>
-      <w:proofErr w:type="spellStart"/>
-      <w:r>
-        <w:t>and</w:t>
-      </w:r>
-      <w:proofErr w:type="spellEnd"/>
-      <w:r>
-        <w:t xml:space="preserve"> </w:t>
-      </w:r>
-      <w:proofErr w:type="spellStart"/>
-      <w:r>
-        <w:t>Privacy</w:t>
-      </w:r>
-      <w:proofErr w:type="spellEnd"/>
-      <w:r>
-        <w:t>. Disponível em: https://www.nintendo.com/. Acesso em: maio 2026.</w:t>
+        <w:t>MICROSOFT. Xbox Accessibility Guidelines. Disponível em: https://www.xbox.com/en-US/accessibility. Acesso em: maio 2026.</w:t>
       </w:r>
     </w:p>
     <w:p>
@@ -2304,14 +1961,55 @@
         <w:ind w:left="709" w:hanging="709"/>
         <w:jc w:val="both"/>
       </w:pPr>
-    </w:p>
-    <w:p>
-      <w:r>
-        <w:br w:type="page"/>
-      </w:r>
-    </w:p>
-    <w:p/>
+      <w:r>
+        <w:t>NAUGHTY DOG. The Last of Us Part II - Accessibility Features. Sony Interactive Entertainment, 2020</w:t>
+      </w:r>
+    </w:p>
+    <w:p>
+      <w:pPr>
+        <w:spacing w:after="240"/>
+        <w:ind w:left="709" w:hanging="709"/>
+        <w:jc w:val="both"/>
+      </w:pPr>
+      <w:r>
+        <w:t>NINTENDO. Nintendo's Approach to Online Safety and Privacy. Disponível em: https://www.nintendo.com/. Acesso em: maio 2026.</w:t>
+      </w:r>
+    </w:p>
+    <w:p>
+      <w:pPr>
+        <w:spacing w:after="240"/>
+        <w:ind w:left="709" w:hanging="709"/>
+        <w:jc w:val="both"/>
+        <w:rPr>
+          <w:u w:val="single"/>
+        </w:rPr>
+      </w:pPr>
+    </w:p>
+    <w:p>
+      <w:pPr>
+        <w:spacing w:after="240"/>
+        <w:ind w:left="709" w:hanging="709"/>
+        <w:jc w:val="both"/>
+      </w:pPr>
+      <w:r>
+        <w:t>PESQUISA GAME BRASIL. Pesquisa Game Brasil 2025. São Paulo: PGB, 2025.</w:t>
+      </w:r>
+    </w:p>
+    <w:p>
+      <w:pPr>
+        <w:spacing w:after="240"/>
+        <w:ind w:left="709" w:hanging="709"/>
+        <w:jc w:val="both"/>
+      </w:pPr>
+    </w:p>
+    <w:p>
+      <w:pPr>
+        <w:spacing w:after="240"/>
+        <w:jc w:val="both"/>
+      </w:pPr>
+    </w:p>
     <w:sectPr>
+      <w:footerReference w:type="default" r:id="rId13"/>
       <w:pgSz w:w="11906" w:h="16838"/>
       <w:pgMar w:top="1701" w:right="1134" w:bottom="1134" w:left="1701" w:header="708" w:footer="708" w:gutter="0"/>
       <w:pgNumType w:start="1"/>
@@ -2322,8 +2020,100 @@
 </w:document>
 </file>
 
+<file path=word/endnotes.xml><?xml version="1.0" encoding="utf-8"?>
+<w:endnotes xmlns:wpc="http://schemas.microsoft.com/office/word/2010/wordprocessingCanvas" xmlns:cx="http://schemas.microsoft.com/office/drawing/2014/chartex" xmlns:cx1="http://schemas.microsoft.com/office/drawing/2015/9/8/chartex" xmlns:cx2="http://schemas.microsoft.com/office/drawing/2015/10/21/chartex" xmlns:cx3="http://schemas.microsoft.com/office/drawing/2016/5/9/chartex" xmlns:cx4="http://schemas.microsoft.com/office/drawing/2016/5/10/chartex" xmlns:cx5="http://schemas.microsoft.com/office/drawing/2016/5/11/chartex" xmlns:cx6="http://schemas.microsoft.com/office/drawing/2016/5/12/chartex" xmlns:cx7="http://schemas.microsoft.com/office/drawing/2016/5/13/chartex" xmlns:cx8="http://schemas.microsoft.com/office/drawing/2016/5/14/chartex" xmlns:mc="http://schemas.openxmlformats.org/markup-compatibility/2006" xmlns:aink="http://schemas.microsoft.com/office/drawing/2016/ink" xmlns:am3d="http://schemas.microsoft.com/office/drawing/2017/model3d" xmlns:o="urn:schemas-microsoft-com:office:office" xmlns:oel="http://schemas.microsoft.com/office/2019/extlst" xmlns:r="http://schemas.openxmlformats.org/officeDocument/2006/relationships" xmlns:m="http://schemas.openxmlformats.org/officeDocument/2006/math" xmlns:v="urn:schemas-microsoft-com:vml" xmlns:wp14="http://schemas.microsoft.com/office/word/2010/wordprocessingDrawing" xmlns:wp="http://schemas.openxmlformats.org/drawingml/2006/wordprocessingDrawing" xmlns:w10="urn:schemas-microsoft-com:office:word" xmlns:w="http://schemas.openxmlformats.org/wordprocessingml/2006/main" xmlns:w14="http://schemas.microsoft.com/office/word/2010/wordml" xmlns:w15="http://schemas.microsoft.com/office/word/2012/wordml" xmlns:w16cex="http://schemas.microsoft.com/office/word/2018/wordml/cex" xmlns:w16cid="http://schemas.microsoft.com/office/word/2016/wordml/cid" xmlns:w16="http://schemas.microsoft.com/office/word/2018/wordml" xmlns:w16sdtdh="http://schemas.microsoft.com/office/word/2020/wordml/sdtdatahash" xmlns:w16se="http://schemas.microsoft.com/office/word/2015/wordml/symex" xmlns:wpg="http://schemas.microsoft.com/office/word/2010/wordprocessingGroup" xmlns:wpi="http://schemas.microsoft.com/office/word/2010/wordprocessingInk" xmlns:wne="http://schemas.microsoft.com/office/word/2006/wordml" xmlns:wps="http://schemas.microsoft.com/office/word/2010/wordprocessingShape" mc:Ignorable="w14 w15 w16se w16cid w16 w16cex w16sdtdh wp14">
+  <w:endnote w:type="separator" w:id="-1">
+    <w:p>
+      <w:pPr>
+        <w:spacing w:line="240" w:lineRule="auto"/>
+      </w:pPr>
+      <w:r>
+        <w:separator/>
+      </w:r>
+    </w:p>
+  </w:endnote>
+  <w:endnote w:type="continuationSeparator" w:id="0">
+    <w:p>
+      <w:pPr>
+        <w:spacing w:line="240" w:lineRule="auto"/>
+      </w:pPr>
+      <w:r>
+        <w:continuationSeparator/>
+      </w:r>
+    </w:p>
+  </w:endnote>
+</w:endnotes>
+</file>
+
+<file path=word/footer1.xml><?xml version="1.0" encoding="utf-8"?>
+<w:ftr xmlns:wpc="http://schemas.microsoft.com/office/word/2010/wordprocessingCanvas" xmlns:cx="http://schemas.microsoft.com/office/drawing/2014/chartex" xmlns:cx1="http://schemas.microsoft.com/office/drawing/2015/9/8/chartex" xmlns:cx2="http://schemas.microsoft.com/office/drawing/2015/10/21/chartex" xmlns:cx3="http://schemas.microsoft.com/office/drawing/2016/5/9/chartex" xmlns:cx4="http://schemas.microsoft.com/office/drawing/2016/5/10/chartex" xmlns:cx5="http://schemas.microsoft.com/office/drawing/2016/5/11/chartex" xmlns:cx6="http://schemas.microsoft.com/office/drawing/2016/5/12/chartex" xmlns:cx7="http://schemas.microsoft.com/office/drawing/2016/5/13/chartex" xmlns:cx8="http://schemas.microsoft.com/office/drawing/2016/5/14/chartex" xmlns:mc="http://schemas.openxmlformats.org/markup-compatibility/2006" xmlns:aink="http://schemas.microsoft.com/office/drawing/2016/ink" xmlns:am3d="http://schemas.microsoft.com/office/drawing/2017/model3d" xmlns:o="urn:schemas-microsoft-com:office:office" xmlns:oel="http://schemas.microsoft.com/office/2019/extlst" xmlns:r="http://schemas.openxmlformats.org/officeDocument/2006/relationships" xmlns:m="http://schemas.openxmlformats.org/officeDocument/2006/math" xmlns:v="urn:schemas-microsoft-com:vml" xmlns:wp14="http://schemas.microsoft.com/office/word/2010/wordprocessingDrawing" xmlns:wp="http://schemas.openxmlformats.org/drawingml/2006/wordprocessingDrawing" xmlns:w10="urn:schemas-microsoft-com:office:word" xmlns:w="http://schemas.openxmlformats.org/wordprocessingml/2006/main" xmlns:w14="http://schemas.microsoft.com/office/word/2010/wordml" xmlns:w15="http://schemas.microsoft.com/office/word/2012/wordml" xmlns:w16cex="http://schemas.microsoft.com/office/word/2018/wordml/cex" xmlns:w16cid="http://schemas.microsoft.com/office/word/2016/wordml/cid" xmlns:w16="http://schemas.microsoft.com/office/word/2018/wordml" xmlns:w16sdtdh="http://schemas.microsoft.com/office/word/2020/wordml/sdtdatahash" xmlns:w16se="http://schemas.microsoft.com/office/word/2015/wordml/symex" xmlns:wpg="http://schemas.microsoft.com/office/word/2010/wordprocessingGroup" xmlns:wpi="http://schemas.microsoft.com/office/word/2010/wordprocessingInk" xmlns:wne="http://schemas.microsoft.com/office/word/2006/wordml" xmlns:wps="http://schemas.microsoft.com/office/word/2010/wordprocessingShape" mc:Ignorable="w14 w15 w16se w16cid w16 w16cex w16sdtdh wp14">
+  <w:sdt>
+    <w:sdtPr>
+      <w:id w:val="-168955331"/>
+      <w:docPartObj>
+        <w:docPartGallery w:val="Page Numbers (Bottom of Page)"/>
+        <w:docPartUnique/>
+      </w:docPartObj>
+    </w:sdtPr>
+    <w:sdtContent>
+      <w:p>
+        <w:pPr>
+          <w:pStyle w:val="Rodap"/>
+          <w:jc w:val="right"/>
+        </w:pPr>
+        <w:r>
+          <w:fldChar w:fldCharType="begin"/>
+        </w:r>
+        <w:r>
+          <w:instrText>PAGE   \* MERGEFORMAT</w:instrText>
+        </w:r>
+        <w:r>
+          <w:fldChar w:fldCharType="separate"/>
+        </w:r>
+        <w:r>
+          <w:t>2</w:t>
+        </w:r>
+        <w:r>
+          <w:fldChar w:fldCharType="end"/>
+        </w:r>
+      </w:p>
+    </w:sdtContent>
+  </w:sdt>
+  <w:p>
+    <w:pPr>
+      <w:pStyle w:val="Rodap"/>
+    </w:pPr>
+  </w:p>
+</w:ftr>
+</file>
+
+<file path=word/footnotes.xml><?xml version="1.0" encoding="utf-8"?>
+<w:footnotes xmlns:wpc="http://schemas.microsoft.com/office/word/2010/wordprocessingCanvas" xmlns:cx="http://schemas.microsoft.com/office/drawing/2014/chartex" xmlns:cx1="http://schemas.microsoft.com/office/drawing/2015/9/8/chartex" xmlns:cx2="http://schemas.microsoft.com/office/drawing/2015/10/21/chartex" xmlns:cx3="http://schemas.microsoft.com/office/drawing/2016/5/9/chartex" xmlns:cx4="http://schemas.microsoft.com/office/drawing/2016/5/10/chartex" xmlns:cx5="http://schemas.microsoft.com/office/drawing/2016/5/11/chartex" xmlns:cx6="http://schemas.microsoft.com/office/drawing/2016/5/12/chartex" xmlns:cx7="http://schemas.microsoft.com/office/drawing/2016/5/13/chartex" xmlns:cx8="http://schemas.microsoft.com/office/drawing/2016/5/14/chartex" xmlns:mc="http://schemas.openxmlformats.org/markup-compatibility/2006" xmlns:aink="http://schemas.microsoft.com/office/drawing/2016/ink" xmlns:am3d="http://schemas.microsoft.com/office/drawing/2017/model3d" xmlns:o="urn:schemas-microsoft-com:office:office" xmlns:oel="http://schemas.microsoft.com/office/2019/extlst" xmlns:r="http://schemas.openxmlformats.org/officeDocument/2006/relationships" xmlns:m="http://schemas.openxmlformats.org/officeDocument/2006/math" xmlns:v="urn:schemas-microsoft-com:vml" xmlns:wp14="http://schemas.microsoft.com/office/word/2010/wordprocessingDrawing" xmlns:wp="http://schemas.openxmlformats.org/drawingml/2006/wordprocessingDrawing" xmlns:w10="urn:schemas-microsoft-com:office:word" xmlns:w="http://schemas.openxmlformats.org/wordprocessingml/2006/main" xmlns:w14="http://schemas.microsoft.com/office/word/2010/wordml" xmlns:w15="http://schemas.microsoft.com/office/word/2012/wordml" xmlns:w16cex="http://schemas.microsoft.com/office/word/2018/wordml/cex" xmlns:w16cid="http://schemas.microsoft.com/office/word/2016/wordml/cid" xmlns:w16="http://schemas.microsoft.com/office/word/2018/wordml" xmlns:w16sdtdh="http://schemas.microsoft.com/office/word/2020/wordml/sdtdatahash" xmlns:w16se="http://schemas.microsoft.com/office/word/2015/wordml/symex" xmlns:wpg="http://schemas.microsoft.com/office/word/2010/wordprocessingGroup" xmlns:wpi="http://schemas.microsoft.com/office/word/2010/wordprocessingInk" xmlns:wne="http://schemas.microsoft.com/office/word/2006/wordml" xmlns:wps="http://schemas.microsoft.com/office/word/2010/wordprocessingShape" mc:Ignorable="w14 w15 w16se w16cid w16 w16cex w16sdtdh wp14">
+  <w:footnote w:type="separator" w:id="-1">
+    <w:p>
+      <w:pPr>
+        <w:spacing w:line="240" w:lineRule="auto"/>
+      </w:pPr>
+      <w:r>
+        <w:separator/>
+      </w:r>
+    </w:p>
+  </w:footnote>
+  <w:footnote w:type="continuationSeparator" w:id="0">
+    <w:p>
+      <w:pPr>
+        <w:spacing w:line="240" w:lineRule="auto"/>
+      </w:pPr>
+      <w:r>
+        <w:continuationSeparator/>
+      </w:r>
+    </w:p>
+  </w:footnote>
+</w:footnotes>
+</file>
+
 <file path=word/numbering.xml><?xml version="1.0" encoding="utf-8"?>
-<w:numbering xmlns:wpc="http://schemas.microsoft.com/office/word/2010/wordprocessingCanvas" xmlns:cx="http://schemas.microsoft.com/office/drawing/2014/chartex" xmlns:cx1="http://schemas.microsoft.com/office/drawing/2015/9/8/chartex" xmlns:cx2="http://schemas.microsoft.com/office/drawing/2015/10/21/chartex" xmlns:cx3="http://schemas.microsoft.com/office/drawing/2016/5/9/chartex" xmlns:cx4="http://schemas.microsoft.com/office/drawing/2016/5/10/chartex" xmlns:cx5="http://schemas.microsoft.com/office/drawing/2016/5/11/chartex" xmlns:cx6="http://schemas.microsoft.com/office/drawing/2016/5/12/chartex" xmlns:cx7="http://schemas.microsoft.com/office/drawing/2016/5/13/chartex" xmlns:cx8="http://schemas.microsoft.com/office/drawing/2016/5/14/chartex" xmlns:mc="http://schemas.openxmlformats.org/markup-compatibility/2006" xmlns:aink="http://schemas.microsoft.com/office/drawing/2016/ink" xmlns:am3d="http://schemas.microsoft.com/office/drawing/2017/model3d" xmlns:o="urn:schemas-microsoft-com:office:office" xmlns:r="http://schemas.openxmlformats.org/officeDocument/2006/relationships" xmlns:m="http://schemas.openxmlformats.org/officeDocument/2006/math" xmlns:v="urn:schemas-microsoft-com:vml" xmlns:wp14="http://schemas.microsoft.com/office/word/2010/wordprocessingDrawing" xmlns:wp="http://schemas.openxmlformats.org/drawingml/2006/wordprocessingDrawing" xmlns:w10="urn:schemas-microsoft-com:office:word" xmlns:w="http://schemas.openxmlformats.org/wordprocessingml/2006/main" xmlns:w14="http://schemas.microsoft.com/office/word/2010/wordml" xmlns:w15="http://schemas.microsoft.com/office/word/2012/wordml" xmlns:w16cid="http://schemas.microsoft.com/office/word/2016/wordml/cid" xmlns:w16se="http://schemas.microsoft.com/office/word/2015/wordml/symex" xmlns:wpg="http://schemas.microsoft.com/office/word/2010/wordprocessingGroup" xmlns:wpi="http://schemas.microsoft.com/office/word/2010/wordprocessingInk" xmlns:wne="http://schemas.microsoft.com/office/word/2006/wordml" xmlns:wps="http://schemas.microsoft.com/office/word/2010/wordprocessingShape" mc:Ignorable="w14 w15 w16se w16cid wp14">
+<w:numbering xmlns:wpc="http://schemas.microsoft.com/office/word/2010/wordprocessingCanvas" xmlns:cx="http://schemas.microsoft.com/office/drawing/2014/chartex" xmlns:cx1="http://schemas.microsoft.com/office/drawing/2015/9/8/chartex" xmlns:cx2="http://schemas.microsoft.com/office/drawing/2015/10/21/chartex" xmlns:cx3="http://schemas.microsoft.com/office/drawing/2016/5/9/chartex" xmlns:cx4="http://schemas.microsoft.com/office/drawing/2016/5/10/chartex" xmlns:cx5="http://schemas.microsoft.com/office/drawing/2016/5/11/chartex" xmlns:cx6="http://schemas.microsoft.com/office/drawing/2016/5/12/chartex" xmlns:cx7="http://schemas.microsoft.com/office/drawing/2016/5/13/chartex" xmlns:cx8="http://schemas.microsoft.com/office/drawing/2016/5/14/chartex" xmlns:mc="http://schemas.openxmlformats.org/markup-compatibility/2006" xmlns:aink="http://schemas.microsoft.com/office/drawing/2016/ink" xmlns:am3d="http://schemas.microsoft.com/office/drawing/2017/model3d" xmlns:o="urn:schemas-microsoft-com:office:office" xmlns:oel="http://schemas.microsoft.com/office/2019/extlst" xmlns:r="http://schemas.openxmlformats.org/officeDocument/2006/relationships" xmlns:m="http://schemas.openxmlformats.org/officeDocument/2006/math" xmlns:v="urn:schemas-microsoft-com:vml" xmlns:wp14="http://schemas.microsoft.com/office/word/2010/wordprocessingDrawing" xmlns:wp="http://schemas.openxmlformats.org/drawingml/2006/wordprocessingDrawing" xmlns:w10="urn:schemas-microsoft-com:office:word" xmlns:w="http://schemas.openxmlformats.org/wordprocessingml/2006/main" xmlns:w14="http://schemas.microsoft.com/office/word/2010/wordml" xmlns:w15="http://schemas.microsoft.com/office/word/2012/wordml" xmlns:w16cex="http://schemas.microsoft.com/office/word/2018/wordml/cex" xmlns:w16cid="http://schemas.microsoft.com/office/word/2016/wordml/cid" xmlns:w16="http://schemas.microsoft.com/office/word/2018/wordml" xmlns:w16sdtdh="http://schemas.microsoft.com/office/word/2020/wordml/sdtdatahash" xmlns:w16se="http://schemas.microsoft.com/office/word/2015/wordml/symex" xmlns:wpg="http://schemas.microsoft.com/office/word/2010/wordprocessingGroup" xmlns:wpi="http://schemas.microsoft.com/office/word/2010/wordprocessingInk" xmlns:wne="http://schemas.microsoft.com/office/word/2006/wordml" xmlns:wps="http://schemas.microsoft.com/office/word/2010/wordprocessingShape" mc:Ignorable="w14 w15 w16se w16cid w16 w16cex w16sdtdh wp14">
   <w:abstractNum w:abstractNumId="0" w15:restartNumberingAfterBreak="0">
     <w:nsid w:val="05DC6C80"/>
     <w:multiLevelType w:val="multilevel"/>
@@ -2911,32 +2701,32 @@
       <w:lvlJc w:val="left"/>
     </w:lvl>
   </w:abstractNum>
-  <w:num w:numId="1">
+  <w:num w:numId="1" w16cid:durableId="1724013511">
     <w:abstractNumId w:val="1"/>
     <w:lvlOverride w:ilvl="0">
       <w:startOverride w:val="1"/>
     </w:lvlOverride>
   </w:num>
-  <w:num w:numId="2">
+  <w:num w:numId="2" w16cid:durableId="1023283437">
     <w:abstractNumId w:val="4"/>
     <w:lvlOverride w:ilvl="0">
       <w:startOverride w:val="1"/>
     </w:lvlOverride>
   </w:num>
-  <w:num w:numId="3">
+  <w:num w:numId="3" w16cid:durableId="778715725">
     <w:abstractNumId w:val="0"/>
   </w:num>
-  <w:num w:numId="4">
+  <w:num w:numId="4" w16cid:durableId="1329744966">
     <w:abstractNumId w:val="3"/>
   </w:num>
-  <w:num w:numId="5">
+  <w:num w:numId="5" w16cid:durableId="205652695">
     <w:abstractNumId w:val="2"/>
   </w:num>
 </w:numbering>
 </file>
 
 <file path=word/styles.xml><?xml version="1.0" encoding="utf-8"?>
-<w:styles xmlns:mc="http://schemas.openxmlformats.org/markup-compatibility/2006" xmlns:r="http://schemas.openxmlformats.org/officeDocument/2006/relationships" xmlns:w="http://schemas.openxmlformats.org/wordprocessingml/2006/main" xmlns:w14="http://schemas.microsoft.com/office/word/2010/wordml" xmlns:w15="http://schemas.microsoft.com/office/word/2012/wordml" xmlns:w16cid="http://schemas.microsoft.com/office/word/2016/wordml/cid" xmlns:w16se="http://schemas.microsoft.com/office/word/2015/wordml/symex" mc:Ignorable="w14 w15 w16se w16cid">
+<w:styles xmlns:mc="http://schemas.openxmlformats.org/markup-compatibility/2006" xmlns:r="http://schemas.openxmlformats.org/officeDocument/2006/relationships" xmlns:w="http://schemas.openxmlformats.org/wordprocessingml/2006/main" xmlns:w14="http://schemas.microsoft.com/office/word/2010/wordml" xmlns:w15="http://schemas.microsoft.com/office/word/2012/wordml" xmlns:w16cex="http://schemas.microsoft.com/office/word/2018/wordml/cex" xmlns:w16cid="http://schemas.microsoft.com/office/word/2016/wordml/cid" xmlns:w16="http://schemas.microsoft.com/office/word/2018/wordml" xmlns:w16sdtdh="http://schemas.microsoft.com/office/word/2020/wordml/sdtdatahash" xmlns:w16se="http://schemas.microsoft.com/office/word/2015/wordml/symex" mc:Ignorable="w14 w15 w16se w16cid w16 w16cex w16sdtdh">
   <w:docDefaults>
     <w:rPrDefault>
       <w:rPr>
@@ -2952,7 +2742,7 @@
       </w:pPr>
     </w:pPrDefault>
   </w:docDefaults>
-  <w:latentStyles w:defLockedState="0" w:defUIPriority="99" w:defSemiHidden="0" w:defUnhideWhenUsed="0" w:defQFormat="0" w:count="375">
+  <w:latentStyles w:defLockedState="0" w:defUIPriority="99" w:defSemiHidden="0" w:defUnhideWhenUsed="0" w:defQFormat="0" w:count="376">
     <w:lsdException w:name="Normal" w:uiPriority="0" w:qFormat="1"/>
     <w:lsdException w:name="heading 1" w:uiPriority="9" w:qFormat="1"/>
     <w:lsdException w:name="heading 2" w:semiHidden="1" w:uiPriority="9" w:unhideWhenUsed="1" w:qFormat="1"/>
@@ -3328,6 +3118,7 @@
     <w:lsdException w:name="Smart Hyperlink" w:semiHidden="1" w:unhideWhenUsed="1"/>
     <w:lsdException w:name="Hashtag" w:semiHidden="1" w:unhideWhenUsed="1"/>
     <w:lsdException w:name="Unresolved Mention" w:semiHidden="1" w:unhideWhenUsed="1"/>
+    <w:lsdException w:name="Smart Link" w:semiHidden="1" w:unhideWhenUsed="1"/>
   </w:latentStyles>
   <w:style w:type="paragraph" w:default="1" w:styleId="Normal">
     <w:name w:val="Normal"/>
@@ -3414,7 +3205,6 @@
   <w:style w:type="character" w:default="1" w:styleId="Fontepargpadro">
     <w:name w:val="Default Paragraph Font"/>
     <w:uiPriority w:val="1"/>
-    <w:semiHidden/>
     <w:unhideWhenUsed/>
   </w:style>
   <w:style w:type="table" w:default="1" w:styleId="Tabelanormal">
@@ -3564,6 +3354,50 @@
     <w:name w:val="whitespace-normal"/>
     <w:basedOn w:val="Fontepargpadro"/>
     <w:rsid w:val="007765FD"/>
+  </w:style>
+  <w:style w:type="paragraph" w:styleId="Cabealho">
+    <w:name w:val="header"/>
+    <w:basedOn w:val="Normal"/>
+    <w:link w:val="CabealhoChar"/>
+    <w:uiPriority w:val="99"/>
+    <w:unhideWhenUsed/>
+    <w:rsid w:val="00E3674B"/>
+    <w:pPr>
+      <w:tabs>
+        <w:tab w:val="center" w:pos="4252"/>
+        <w:tab w:val="right" w:pos="8504"/>
+      </w:tabs>
+      <w:spacing w:line="240" w:lineRule="auto"/>
+    </w:pPr>
+  </w:style>
+  <w:style w:type="character" w:customStyle="1" w:styleId="CabealhoChar">
+    <w:name w:val="Cabeçalho Char"/>
+    <w:basedOn w:val="Fontepargpadro"/>
+    <w:link w:val="Cabealho"/>
+    <w:uiPriority w:val="99"/>
+    <w:rsid w:val="00E3674B"/>
+  </w:style>
+  <w:style w:type="paragraph" w:styleId="Rodap">
+    <w:name w:val="footer"/>
+    <w:basedOn w:val="Normal"/>
+    <w:link w:val="RodapChar"/>
+    <w:uiPriority w:val="99"/>
+    <w:unhideWhenUsed/>
+    <w:rsid w:val="00E3674B"/>
+    <w:pPr>
+      <w:tabs>
+        <w:tab w:val="center" w:pos="4252"/>
+        <w:tab w:val="right" w:pos="8504"/>
+      </w:tabs>
+      <w:spacing w:line="240" w:lineRule="auto"/>
+    </w:pPr>
+  </w:style>
+  <w:style w:type="character" w:customStyle="1" w:styleId="RodapChar">
+    <w:name w:val="Rodapé Char"/>
+    <w:basedOn w:val="Fontepargpadro"/>
+    <w:link w:val="Rodap"/>
+    <w:uiPriority w:val="99"/>
+    <w:rsid w:val="00E3674B"/>
   </w:style>
 </w:styles>
 </file>
@@ -4034,8 +3868,14 @@
 <ds:datastoreItem xmlns:ds="http://schemas.openxmlformats.org/officeDocument/2006/customXml" ds:itemID="{8ACE1D2B-CB30-4A79-9529-002C3FBCAABC}">
   <ds:schemaRefs>
     <ds:schemaRef ds:uri="http://schemas.microsoft.com/office/2006/metadata/properties"/>
+    <ds:schemaRef ds:uri="http://purl.org/dc/terms/"/>
+    <ds:schemaRef ds:uri="cad2fdee-5bc2-4e59-8f6d-8fb6c4a72a29"/>
+    <ds:schemaRef ds:uri="http://purl.org/dc/elements/1.1/"/>
+    <ds:schemaRef ds:uri="http://schemas.microsoft.com/office/2006/documentManagement/types"/>
     <ds:schemaRef ds:uri="http://schemas.microsoft.com/office/infopath/2007/PartnerControls"/>
-    <ds:schemaRef ds:uri="cad2fdee-5bc2-4e59-8f6d-8fb6c4a72a29"/>
+    <ds:schemaRef ds:uri="http://schemas.openxmlformats.org/package/2006/metadata/core-properties"/>
+    <ds:schemaRef ds:uri="http://www.w3.org/XML/1998/namespace"/>
+    <ds:schemaRef ds:uri="http://purl.org/dc/dcmitype/"/>
   </ds:schemaRefs>
 </ds:datastoreItem>
 </file>

</xml_diff>